<commit_message>
Completed worksheet for Checkpoint 2.1
</commit_message>
<xml_diff>
--- a/Checkpoint 2.1/Required_Capstone_Checkpoint_2_1_Worksheet-1.docx
+++ b/Checkpoint 2.1/Required_Capstone_Checkpoint_2_1_Worksheet-1.docx
@@ -488,7 +488,7 @@
         <w:rPr>
           <w:rFonts w:ascii="Segoe UI Symbol" w:hAnsi="Segoe UI Symbol" w:cs="Segoe UI Symbol"/>
         </w:rPr>
-        <w:t>☐</w:t>
+        <w:t>X</w:t>
       </w:r>
       <w:r>
         <w:t xml:space="preserve"> Wikipedia Retrieval Engine </w:t>
@@ -565,53 +565,39 @@
                 <w:sz w:val="24"/>
                 <w:szCs w:val="24"/>
               </w:rPr>
-              <w:t>Response:</w:t>
-            </w:r>
-          </w:p>
-          <w:p>
-            <w:pPr>
-              <w:spacing w:after="120"/>
-              <w:rPr>
-                <w:sz w:val="24"/>
-                <w:szCs w:val="24"/>
-              </w:rPr>
-            </w:pPr>
-          </w:p>
-          <w:p>
-            <w:pPr>
-              <w:spacing w:after="120"/>
-              <w:rPr>
-                <w:sz w:val="24"/>
-                <w:szCs w:val="24"/>
-              </w:rPr>
-            </w:pPr>
-          </w:p>
-          <w:p>
-            <w:pPr>
-              <w:spacing w:after="120"/>
-              <w:rPr>
-                <w:sz w:val="24"/>
-                <w:szCs w:val="24"/>
-              </w:rPr>
-            </w:pPr>
-          </w:p>
-          <w:p>
-            <w:pPr>
-              <w:spacing w:after="120"/>
-              <w:rPr>
-                <w:sz w:val="24"/>
-                <w:szCs w:val="24"/>
-              </w:rPr>
-            </w:pPr>
-          </w:p>
-          <w:p>
-            <w:pPr>
-              <w:spacing w:after="120"/>
-              <w:rPr>
-                <w:sz w:val="24"/>
-                <w:szCs w:val="24"/>
-              </w:rPr>
-            </w:pPr>
+              <w:t xml:space="preserve">I chose to implement a hybrid retriever. For a corpus of knowledge-dense articles which </w:t>
+            </w:r>
+            <w:proofErr w:type="gramStart"/>
+            <w:r>
+              <w:rPr>
+                <w:sz w:val="24"/>
+                <w:szCs w:val="24"/>
+              </w:rPr>
+              <w:t>is</w:t>
+            </w:r>
+            <w:proofErr w:type="gramEnd"/>
+            <w:r>
+              <w:rPr>
+                <w:sz w:val="24"/>
+                <w:szCs w:val="24"/>
+              </w:rPr>
+              <w:t xml:space="preserve"> likely to be queried using a mix of specific identifiers and general concepts, this architecture is the best for optimizing both precision and recall, reducing both false positives and false negatives. A keyword-</w:t>
+            </w:r>
+            <w:r>
+              <w:rPr>
+                <w:sz w:val="24"/>
+                <w:szCs w:val="24"/>
+              </w:rPr>
+              <w:lastRenderedPageBreak/>
+              <w:t xml:space="preserve">based retriever would be the fastest and cheapest, but at the expense of false negatives due to lack of semantic understanding or ability to handle paraphrasing. A vector-based retriever would compensate for these weaknesses but at the expense </w:t>
+            </w:r>
+            <w:r>
+              <w:rPr>
+                <w:sz w:val="24"/>
+                <w:szCs w:val="24"/>
+              </w:rPr>
+              <w:t>of poor precision due to lack of ability to home in on the information specific to any identifiers in the query. Both keyword-only and vector-only approaches would also lead to more false positives caused by fabricated and false statements made by LLMs which are goal-oriented and eager to please. A hybrid retriever is the most expensive option with the highest latency due to the burden of retrieving information in two ways and normalizing, ranking and fusing the results, but it is also the most reliable and trustworthy of the three architectural options.</w:t>
+            </w:r>
           </w:p>
         </w:tc>
       </w:tr>
@@ -656,7 +642,27 @@
           <w:sz w:val="24"/>
           <w:szCs w:val="24"/>
         </w:rPr>
-        <w:t>Provide evidence that your retrieval system was implemented and tested.</w:t>
+        <w:t xml:space="preserve">Provide evidence that your retrieval system </w:t>
+      </w:r>
+      <w:proofErr w:type="gramStart"/>
+      <w:r>
+        <w:rPr>
+          <w:rFonts w:eastAsia="Aptos"/>
+          <w:color w:val="000000"/>
+          <w:sz w:val="24"/>
+          <w:szCs w:val="24"/>
+        </w:rPr>
+        <w:t>was</w:t>
+      </w:r>
+      <w:proofErr w:type="gramEnd"/>
+      <w:r>
+        <w:rPr>
+          <w:rFonts w:eastAsia="Aptos"/>
+          <w:color w:val="000000"/>
+          <w:sz w:val="24"/>
+          <w:szCs w:val="24"/>
+        </w:rPr>
+        <w:t xml:space="preserve"> implemented and tested.</w:t>
       </w:r>
       <w:r>
         <w:rPr>
@@ -759,6 +765,7 @@
           </w:tcPr>
           <w:p>
             <w:pPr>
+              <w:spacing w:after="120"/>
               <w:rPr>
                 <w:sz w:val="24"/>
                 <w:szCs w:val="24"/>
@@ -769,7 +776,7 @@
                 <w:sz w:val="24"/>
                 <w:szCs w:val="24"/>
               </w:rPr>
-              <w:t>Response:</w:t>
+              <w:t>I ran a total of 15 queries to test the baseline retriever. Here is a screenshot of the retrieval log.</w:t>
             </w:r>
           </w:p>
           <w:p>
@@ -780,6 +787,54 @@
                 <w:szCs w:val="24"/>
               </w:rPr>
             </w:pPr>
+            <w:r>
+              <w:rPr>
+                <w:noProof/>
+                <w:sz w:val="24"/>
+                <w:szCs w:val="24"/>
+              </w:rPr>
+              <w:drawing>
+                <wp:inline distT="0" distB="0" distL="0" distR="0" wp14:anchorId="2D74E684" wp14:editId="65ABF4CE">
+                  <wp:extent cx="6263640" cy="2928620"/>
+                  <wp:effectExtent l="0" t="0" r="3810" b="5080"/>
+                  <wp:docPr id="601377130" name="Picture 2"/>
+                  <wp:cNvGraphicFramePr>
+                    <a:graphicFrameLocks xmlns:a="http://schemas.openxmlformats.org/drawingml/2006/main" noChangeAspect="1"/>
+                  </wp:cNvGraphicFramePr>
+                  <a:graphic xmlns:a="http://schemas.openxmlformats.org/drawingml/2006/main">
+                    <a:graphicData uri="http://schemas.openxmlformats.org/drawingml/2006/picture">
+                      <pic:pic xmlns:pic="http://schemas.openxmlformats.org/drawingml/2006/picture">
+                        <pic:nvPicPr>
+                          <pic:cNvPr id="601377130" name="Picture 601377130"/>
+                          <pic:cNvPicPr/>
+                        </pic:nvPicPr>
+                        <pic:blipFill>
+                          <a:blip r:embed="rId8" cstate="print">
+                            <a:extLst>
+                              <a:ext uri="{28A0092B-C50C-407E-A947-70E740481C1C}">
+                                <a14:useLocalDpi xmlns:a14="http://schemas.microsoft.com/office/drawing/2010/main" val="0"/>
+                              </a:ext>
+                            </a:extLst>
+                          </a:blip>
+                          <a:stretch>
+                            <a:fillRect/>
+                          </a:stretch>
+                        </pic:blipFill>
+                        <pic:spPr>
+                          <a:xfrm>
+                            <a:off x="0" y="0"/>
+                            <a:ext cx="6263640" cy="2928620"/>
+                          </a:xfrm>
+                          <a:prstGeom prst="rect">
+                            <a:avLst/>
+                          </a:prstGeom>
+                        </pic:spPr>
+                      </pic:pic>
+                    </a:graphicData>
+                  </a:graphic>
+                </wp:inline>
+              </w:drawing>
+            </w:r>
           </w:p>
           <w:p>
             <w:pPr>
@@ -789,6 +844,236 @@
                 <w:szCs w:val="24"/>
               </w:rPr>
             </w:pPr>
+            <w:r>
+              <w:rPr>
+                <w:sz w:val="24"/>
+                <w:szCs w:val="24"/>
+              </w:rPr>
+              <w:t>I modified the code to use a hybrid retriever to replace the simple matching keyword retriever as follows:</w:t>
+            </w:r>
+            <w:r>
+              <w:rPr>
+                <w:sz w:val="24"/>
+                <w:szCs w:val="24"/>
+              </w:rPr>
+              <w:br/>
+            </w:r>
+            <w:r>
+              <w:rPr>
+                <w:sz w:val="24"/>
+                <w:szCs w:val="24"/>
+              </w:rPr>
+              <w:br/>
+            </w:r>
+            <w:r>
+              <w:rPr>
+                <w:sz w:val="24"/>
+                <w:szCs w:val="24"/>
+              </w:rPr>
+              <w:t>def retrieve(query: str, k: int = TOP_K) -&gt; list[tuple[str, str, float]]:</w:t>
+            </w:r>
+            <w:r>
+              <w:rPr>
+                <w:sz w:val="24"/>
+                <w:szCs w:val="24"/>
+              </w:rPr>
+              <w:br/>
+            </w:r>
+            <w:r>
+              <w:rPr>
+                <w:sz w:val="24"/>
+                <w:szCs w:val="24"/>
+              </w:rPr>
+              <w:lastRenderedPageBreak/>
+              <w:t>    """Return the top whole Wikipedia articles using BM25-vector fusion."""</w:t>
+            </w:r>
+            <w:r>
+              <w:rPr>
+                <w:sz w:val="24"/>
+                <w:szCs w:val="24"/>
+              </w:rPr>
+              <w:br/>
+            </w:r>
+            <w:r>
+              <w:rPr>
+                <w:sz w:val="24"/>
+                <w:szCs w:val="24"/>
+              </w:rPr>
+              <w:t>    global _</w:t>
+            </w:r>
+            <w:proofErr w:type="spellStart"/>
+            <w:r>
+              <w:rPr>
+                <w:sz w:val="24"/>
+                <w:szCs w:val="24"/>
+              </w:rPr>
+              <w:t>hybrid_retriever</w:t>
+            </w:r>
+            <w:proofErr w:type="spellEnd"/>
+            <w:r>
+              <w:rPr>
+                <w:sz w:val="24"/>
+                <w:szCs w:val="24"/>
+              </w:rPr>
+              <w:br/>
+            </w:r>
+            <w:r>
+              <w:rPr>
+                <w:sz w:val="24"/>
+                <w:szCs w:val="24"/>
+              </w:rPr>
+              <w:t>    if _</w:t>
+            </w:r>
+            <w:proofErr w:type="spellStart"/>
+            <w:r>
+              <w:rPr>
+                <w:sz w:val="24"/>
+                <w:szCs w:val="24"/>
+              </w:rPr>
+              <w:t>hybrid_retriever</w:t>
+            </w:r>
+            <w:proofErr w:type="spellEnd"/>
+            <w:r>
+              <w:rPr>
+                <w:sz w:val="24"/>
+                <w:szCs w:val="24"/>
+              </w:rPr>
+              <w:t xml:space="preserve"> is None:</w:t>
+            </w:r>
+            <w:r>
+              <w:rPr>
+                <w:sz w:val="24"/>
+                <w:szCs w:val="24"/>
+              </w:rPr>
+              <w:br/>
+            </w:r>
+            <w:r>
+              <w:rPr>
+                <w:sz w:val="24"/>
+                <w:szCs w:val="24"/>
+              </w:rPr>
+              <w:t>        _</w:t>
+            </w:r>
+            <w:proofErr w:type="spellStart"/>
+            <w:r>
+              <w:rPr>
+                <w:sz w:val="24"/>
+                <w:szCs w:val="24"/>
+              </w:rPr>
+              <w:t>hybrid_retriever</w:t>
+            </w:r>
+            <w:proofErr w:type="spellEnd"/>
+            <w:r>
+              <w:rPr>
+                <w:sz w:val="24"/>
+                <w:szCs w:val="24"/>
+              </w:rPr>
+              <w:t xml:space="preserve"> = </w:t>
+            </w:r>
+            <w:proofErr w:type="spellStart"/>
+            <w:r>
+              <w:rPr>
+                <w:sz w:val="24"/>
+                <w:szCs w:val="24"/>
+              </w:rPr>
+              <w:t>WikipediaHybridRetriever</w:t>
+            </w:r>
+            <w:proofErr w:type="spellEnd"/>
+            <w:r>
+              <w:rPr>
+                <w:sz w:val="24"/>
+                <w:szCs w:val="24"/>
+              </w:rPr>
+              <w:t>(</w:t>
+            </w:r>
+            <w:r>
+              <w:rPr>
+                <w:sz w:val="24"/>
+                <w:szCs w:val="24"/>
+              </w:rPr>
+              <w:br/>
+            </w:r>
+            <w:r>
+              <w:rPr>
+                <w:sz w:val="24"/>
+                <w:szCs w:val="24"/>
+              </w:rPr>
+              <w:t>            WIKIPEDIA_DOCS,</w:t>
+            </w:r>
+            <w:r>
+              <w:rPr>
+                <w:sz w:val="24"/>
+                <w:szCs w:val="24"/>
+              </w:rPr>
+              <w:br/>
+            </w:r>
+            <w:r>
+              <w:rPr>
+                <w:sz w:val="24"/>
+                <w:szCs w:val="24"/>
+              </w:rPr>
+              <w:t xml:space="preserve">            </w:t>
+            </w:r>
+            <w:proofErr w:type="spellStart"/>
+            <w:r>
+              <w:rPr>
+                <w:sz w:val="24"/>
+                <w:szCs w:val="24"/>
+              </w:rPr>
+              <w:t>build_or_load_wikipedia_db</w:t>
+            </w:r>
+            <w:proofErr w:type="spellEnd"/>
+            <w:r>
+              <w:rPr>
+                <w:sz w:val="24"/>
+                <w:szCs w:val="24"/>
+              </w:rPr>
+              <w:t>(),</w:t>
+            </w:r>
+            <w:r>
+              <w:rPr>
+                <w:sz w:val="24"/>
+                <w:szCs w:val="24"/>
+              </w:rPr>
+              <w:br/>
+            </w:r>
+            <w:r>
+              <w:rPr>
+                <w:sz w:val="24"/>
+                <w:szCs w:val="24"/>
+              </w:rPr>
+              <w:t>        )</w:t>
+            </w:r>
+            <w:r>
+              <w:rPr>
+                <w:sz w:val="24"/>
+                <w:szCs w:val="24"/>
+              </w:rPr>
+              <w:br/>
+            </w:r>
+            <w:r>
+              <w:rPr>
+                <w:sz w:val="24"/>
+                <w:szCs w:val="24"/>
+              </w:rPr>
+              <w:t>    return _</w:t>
+            </w:r>
+            <w:proofErr w:type="spellStart"/>
+            <w:r>
+              <w:rPr>
+                <w:sz w:val="24"/>
+                <w:szCs w:val="24"/>
+              </w:rPr>
+              <w:t>hybrid_retriever.get_top_k</w:t>
+            </w:r>
+            <w:proofErr w:type="spellEnd"/>
+            <w:r>
+              <w:rPr>
+                <w:sz w:val="24"/>
+                <w:szCs w:val="24"/>
+              </w:rPr>
+              <w:t>(query, k)</w:t>
+            </w:r>
           </w:p>
           <w:p>
             <w:pPr>
@@ -798,6 +1083,324 @@
                 <w:szCs w:val="24"/>
               </w:rPr>
             </w:pPr>
+            <w:r>
+              <w:rPr>
+                <w:sz w:val="24"/>
+                <w:szCs w:val="24"/>
+              </w:rPr>
+              <w:br/>
+              <w:t>I modified the build or load function to build or load a Chroma database of the Wikipedia articles:</w:t>
+            </w:r>
+            <w:r>
+              <w:rPr>
+                <w:sz w:val="24"/>
+                <w:szCs w:val="24"/>
+              </w:rPr>
+              <w:br/>
+            </w:r>
+            <w:r>
+              <w:rPr>
+                <w:sz w:val="24"/>
+                <w:szCs w:val="24"/>
+              </w:rPr>
+              <w:br/>
+            </w:r>
+            <w:r>
+              <w:rPr>
+                <w:sz w:val="24"/>
+                <w:szCs w:val="24"/>
+              </w:rPr>
+              <w:t xml:space="preserve">def </w:t>
+            </w:r>
+            <w:proofErr w:type="spellStart"/>
+            <w:r>
+              <w:rPr>
+                <w:sz w:val="24"/>
+                <w:szCs w:val="24"/>
+              </w:rPr>
+              <w:t>build_or_load_wikipedia_</w:t>
+            </w:r>
+            <w:proofErr w:type="gramStart"/>
+            <w:r>
+              <w:rPr>
+                <w:sz w:val="24"/>
+                <w:szCs w:val="24"/>
+              </w:rPr>
+              <w:t>db</w:t>
+            </w:r>
+            <w:proofErr w:type="spellEnd"/>
+            <w:r>
+              <w:rPr>
+                <w:sz w:val="24"/>
+                <w:szCs w:val="24"/>
+              </w:rPr>
+              <w:t>(</w:t>
+            </w:r>
+            <w:proofErr w:type="gramEnd"/>
+            <w:r>
+              <w:rPr>
+                <w:sz w:val="24"/>
+                <w:szCs w:val="24"/>
+              </w:rPr>
+              <w:t>) -&gt; Chroma:</w:t>
+            </w:r>
+            <w:r>
+              <w:rPr>
+                <w:sz w:val="24"/>
+                <w:szCs w:val="24"/>
+              </w:rPr>
+              <w:br/>
+            </w:r>
+            <w:r>
+              <w:rPr>
+                <w:sz w:val="24"/>
+                <w:szCs w:val="24"/>
+              </w:rPr>
+              <w:t xml:space="preserve">    if </w:t>
+            </w:r>
+            <w:proofErr w:type="spellStart"/>
+            <w:proofErr w:type="gramStart"/>
+            <w:r>
+              <w:rPr>
+                <w:sz w:val="24"/>
+                <w:szCs w:val="24"/>
+              </w:rPr>
+              <w:t>os.path</w:t>
+            </w:r>
+            <w:proofErr w:type="gramEnd"/>
+            <w:r>
+              <w:rPr>
+                <w:sz w:val="24"/>
+                <w:szCs w:val="24"/>
+              </w:rPr>
+              <w:t>.</w:t>
+            </w:r>
+            <w:proofErr w:type="gramStart"/>
+            <w:r>
+              <w:rPr>
+                <w:sz w:val="24"/>
+                <w:szCs w:val="24"/>
+              </w:rPr>
+              <w:t>isdir</w:t>
+            </w:r>
+            <w:proofErr w:type="spellEnd"/>
+            <w:r>
+              <w:rPr>
+                <w:sz w:val="24"/>
+                <w:szCs w:val="24"/>
+              </w:rPr>
+              <w:t>(</w:t>
+            </w:r>
+            <w:proofErr w:type="gramEnd"/>
+            <w:r>
+              <w:rPr>
+                <w:sz w:val="24"/>
+                <w:szCs w:val="24"/>
+              </w:rPr>
+              <w:t xml:space="preserve">WIKIPEDIA_CHROMA_DIR) and </w:t>
+            </w:r>
+            <w:proofErr w:type="spellStart"/>
+            <w:proofErr w:type="gramStart"/>
+            <w:r>
+              <w:rPr>
+                <w:sz w:val="24"/>
+                <w:szCs w:val="24"/>
+              </w:rPr>
+              <w:t>os.listdir</w:t>
+            </w:r>
+            <w:proofErr w:type="spellEnd"/>
+            <w:proofErr w:type="gramEnd"/>
+            <w:r>
+              <w:rPr>
+                <w:sz w:val="24"/>
+                <w:szCs w:val="24"/>
+              </w:rPr>
+              <w:t>(WIKIPEDIA_CHROMA_DIR):</w:t>
+            </w:r>
+            <w:r>
+              <w:rPr>
+                <w:sz w:val="24"/>
+                <w:szCs w:val="24"/>
+              </w:rPr>
+              <w:br/>
+            </w:r>
+            <w:r>
+              <w:rPr>
+                <w:sz w:val="24"/>
+                <w:szCs w:val="24"/>
+              </w:rPr>
+              <w:t xml:space="preserve">        </w:t>
+            </w:r>
+            <w:proofErr w:type="gramStart"/>
+            <w:r>
+              <w:rPr>
+                <w:sz w:val="24"/>
+                <w:szCs w:val="24"/>
+              </w:rPr>
+              <w:t>print(</w:t>
+            </w:r>
+            <w:proofErr w:type="spellStart"/>
+            <w:proofErr w:type="gramEnd"/>
+            <w:r>
+              <w:rPr>
+                <w:sz w:val="24"/>
+                <w:szCs w:val="24"/>
+              </w:rPr>
+              <w:t>f"Loading</w:t>
+            </w:r>
+            <w:proofErr w:type="spellEnd"/>
+            <w:r>
+              <w:rPr>
+                <w:sz w:val="24"/>
+                <w:szCs w:val="24"/>
+              </w:rPr>
+              <w:t xml:space="preserve"> existing Wikipedia vector DB from {WIKIPEDIA_CHROMA_DIR}")</w:t>
+            </w:r>
+            <w:r>
+              <w:rPr>
+                <w:sz w:val="24"/>
+                <w:szCs w:val="24"/>
+              </w:rPr>
+              <w:br/>
+            </w:r>
+            <w:r>
+              <w:rPr>
+                <w:sz w:val="24"/>
+                <w:szCs w:val="24"/>
+              </w:rPr>
+              <w:t xml:space="preserve">        return </w:t>
+            </w:r>
+            <w:proofErr w:type="gramStart"/>
+            <w:r>
+              <w:rPr>
+                <w:sz w:val="24"/>
+                <w:szCs w:val="24"/>
+              </w:rPr>
+              <w:t>Chroma(</w:t>
+            </w:r>
+            <w:proofErr w:type="gramEnd"/>
+            <w:r>
+              <w:rPr>
+                <w:sz w:val="24"/>
+                <w:szCs w:val="24"/>
+              </w:rPr>
+              <w:br/>
+            </w:r>
+            <w:r>
+              <w:rPr>
+                <w:sz w:val="24"/>
+                <w:szCs w:val="24"/>
+              </w:rPr>
+              <w:t xml:space="preserve">            </w:t>
+            </w:r>
+            <w:proofErr w:type="spellStart"/>
+            <w:r>
+              <w:rPr>
+                <w:sz w:val="24"/>
+                <w:szCs w:val="24"/>
+              </w:rPr>
+              <w:t>persist_directory</w:t>
+            </w:r>
+            <w:proofErr w:type="spellEnd"/>
+            <w:r>
+              <w:rPr>
+                <w:sz w:val="24"/>
+                <w:szCs w:val="24"/>
+              </w:rPr>
+              <w:t>=WIKIPEDIA_CHROMA_DIR,</w:t>
+            </w:r>
+            <w:r>
+              <w:rPr>
+                <w:sz w:val="24"/>
+                <w:szCs w:val="24"/>
+              </w:rPr>
+              <w:br/>
+            </w:r>
+            <w:r>
+              <w:rPr>
+                <w:sz w:val="24"/>
+                <w:szCs w:val="24"/>
+              </w:rPr>
+              <w:t xml:space="preserve">            </w:t>
+            </w:r>
+            <w:proofErr w:type="spellStart"/>
+            <w:r>
+              <w:rPr>
+                <w:sz w:val="24"/>
+                <w:szCs w:val="24"/>
+              </w:rPr>
+              <w:t>embedding_function</w:t>
+            </w:r>
+            <w:proofErr w:type="spellEnd"/>
+            <w:r>
+              <w:rPr>
+                <w:sz w:val="24"/>
+                <w:szCs w:val="24"/>
+              </w:rPr>
+              <w:t>=</w:t>
+            </w:r>
+            <w:proofErr w:type="spellStart"/>
+            <w:r>
+              <w:rPr>
+                <w:sz w:val="24"/>
+                <w:szCs w:val="24"/>
+              </w:rPr>
+              <w:t>get_</w:t>
+            </w:r>
+            <w:proofErr w:type="gramStart"/>
+            <w:r>
+              <w:rPr>
+                <w:sz w:val="24"/>
+                <w:szCs w:val="24"/>
+              </w:rPr>
+              <w:t>embeddings</w:t>
+            </w:r>
+            <w:proofErr w:type="spellEnd"/>
+            <w:r>
+              <w:rPr>
+                <w:sz w:val="24"/>
+                <w:szCs w:val="24"/>
+              </w:rPr>
+              <w:t>(</w:t>
+            </w:r>
+            <w:proofErr w:type="gramEnd"/>
+            <w:r>
+              <w:rPr>
+                <w:sz w:val="24"/>
+                <w:szCs w:val="24"/>
+              </w:rPr>
+              <w:t>),</w:t>
+            </w:r>
+            <w:r>
+              <w:rPr>
+                <w:sz w:val="24"/>
+                <w:szCs w:val="24"/>
+              </w:rPr>
+              <w:br/>
+            </w:r>
+            <w:r>
+              <w:rPr>
+                <w:sz w:val="24"/>
+                <w:szCs w:val="24"/>
+              </w:rPr>
+              <w:t xml:space="preserve">      </w:t>
+            </w:r>
+            <w:proofErr w:type="gramStart"/>
+            <w:r>
+              <w:rPr>
+                <w:sz w:val="24"/>
+                <w:szCs w:val="24"/>
+              </w:rPr>
+              <w:t>  )</w:t>
+            </w:r>
+            <w:proofErr w:type="gramEnd"/>
+            <w:r>
+              <w:rPr>
+                <w:sz w:val="24"/>
+                <w:szCs w:val="24"/>
+              </w:rPr>
+              <w:br/>
+            </w:r>
           </w:p>
           <w:p>
             <w:pPr>
@@ -807,6 +1410,397 @@
                 <w:szCs w:val="24"/>
               </w:rPr>
             </w:pPr>
+            <w:r>
+              <w:rPr>
+                <w:sz w:val="24"/>
+                <w:szCs w:val="24"/>
+              </w:rPr>
+              <w:t xml:space="preserve">    </w:t>
+            </w:r>
+            <w:proofErr w:type="gramStart"/>
+            <w:r>
+              <w:rPr>
+                <w:sz w:val="24"/>
+                <w:szCs w:val="24"/>
+              </w:rPr>
+              <w:t>print(</w:t>
+            </w:r>
+            <w:proofErr w:type="gramEnd"/>
+            <w:r>
+              <w:rPr>
+                <w:sz w:val="24"/>
+                <w:szCs w:val="24"/>
+              </w:rPr>
+              <w:t xml:space="preserve">"Building Wikipedia vector DB (first run — embedding whole </w:t>
+            </w:r>
+            <w:proofErr w:type="gramStart"/>
+            <w:r>
+              <w:rPr>
+                <w:sz w:val="24"/>
+                <w:szCs w:val="24"/>
+              </w:rPr>
+              <w:t>articles)...</w:t>
+            </w:r>
+            <w:proofErr w:type="gramEnd"/>
+            <w:r>
+              <w:rPr>
+                <w:sz w:val="24"/>
+                <w:szCs w:val="24"/>
+              </w:rPr>
+              <w:t>")</w:t>
+            </w:r>
+            <w:r>
+              <w:rPr>
+                <w:sz w:val="24"/>
+                <w:szCs w:val="24"/>
+              </w:rPr>
+              <w:br/>
+            </w:r>
+            <w:r>
+              <w:rPr>
+                <w:sz w:val="24"/>
+                <w:szCs w:val="24"/>
+              </w:rPr>
+              <w:t>    documents = [</w:t>
+            </w:r>
+            <w:r>
+              <w:rPr>
+                <w:sz w:val="24"/>
+                <w:szCs w:val="24"/>
+              </w:rPr>
+              <w:br/>
+            </w:r>
+            <w:r>
+              <w:rPr>
+                <w:sz w:val="24"/>
+                <w:szCs w:val="24"/>
+              </w:rPr>
+              <w:t xml:space="preserve">        </w:t>
+            </w:r>
+            <w:proofErr w:type="gramStart"/>
+            <w:r>
+              <w:rPr>
+                <w:sz w:val="24"/>
+                <w:szCs w:val="24"/>
+              </w:rPr>
+              <w:t>Document(</w:t>
+            </w:r>
+            <w:proofErr w:type="spellStart"/>
+            <w:proofErr w:type="gramEnd"/>
+            <w:r>
+              <w:rPr>
+                <w:sz w:val="24"/>
+                <w:szCs w:val="24"/>
+              </w:rPr>
+              <w:t>page_content</w:t>
+            </w:r>
+            <w:proofErr w:type="spellEnd"/>
+            <w:r>
+              <w:rPr>
+                <w:sz w:val="24"/>
+                <w:szCs w:val="24"/>
+              </w:rPr>
+              <w:t>=text, metadata</w:t>
+            </w:r>
+            <w:proofErr w:type="gramStart"/>
+            <w:r>
+              <w:rPr>
+                <w:sz w:val="24"/>
+                <w:szCs w:val="24"/>
+              </w:rPr>
+              <w:t>={</w:t>
+            </w:r>
+            <w:proofErr w:type="gramEnd"/>
+            <w:r>
+              <w:rPr>
+                <w:sz w:val="24"/>
+                <w:szCs w:val="24"/>
+              </w:rPr>
+              <w:t>"source": filename})</w:t>
+            </w:r>
+            <w:r>
+              <w:rPr>
+                <w:sz w:val="24"/>
+                <w:szCs w:val="24"/>
+              </w:rPr>
+              <w:br/>
+            </w:r>
+            <w:r>
+              <w:rPr>
+                <w:sz w:val="24"/>
+                <w:szCs w:val="24"/>
+              </w:rPr>
+              <w:t>        for filename, text in WIKIPEDIA_DOCS</w:t>
+            </w:r>
+            <w:r>
+              <w:rPr>
+                <w:sz w:val="24"/>
+                <w:szCs w:val="24"/>
+              </w:rPr>
+              <w:br/>
+            </w:r>
+            <w:r>
+              <w:rPr>
+                <w:sz w:val="24"/>
+                <w:szCs w:val="24"/>
+              </w:rPr>
+              <w:t xml:space="preserve">  </w:t>
+            </w:r>
+            <w:proofErr w:type="gramStart"/>
+            <w:r>
+              <w:rPr>
+                <w:sz w:val="24"/>
+                <w:szCs w:val="24"/>
+              </w:rPr>
+              <w:t>  ]</w:t>
+            </w:r>
+            <w:proofErr w:type="gramEnd"/>
+            <w:r>
+              <w:rPr>
+                <w:sz w:val="24"/>
+                <w:szCs w:val="24"/>
+              </w:rPr>
+              <w:br/>
+            </w:r>
+            <w:r>
+              <w:rPr>
+                <w:sz w:val="24"/>
+                <w:szCs w:val="24"/>
+              </w:rPr>
+              <w:t xml:space="preserve">    </w:t>
+            </w:r>
+            <w:proofErr w:type="spellStart"/>
+            <w:r>
+              <w:rPr>
+                <w:sz w:val="24"/>
+                <w:szCs w:val="24"/>
+              </w:rPr>
+              <w:t>db</w:t>
+            </w:r>
+            <w:proofErr w:type="spellEnd"/>
+            <w:r>
+              <w:rPr>
+                <w:sz w:val="24"/>
+                <w:szCs w:val="24"/>
+              </w:rPr>
+              <w:t xml:space="preserve"> = </w:t>
+            </w:r>
+            <w:proofErr w:type="spellStart"/>
+            <w:r>
+              <w:rPr>
+                <w:sz w:val="24"/>
+                <w:szCs w:val="24"/>
+              </w:rPr>
+              <w:t>Chroma.from_</w:t>
+            </w:r>
+            <w:proofErr w:type="gramStart"/>
+            <w:r>
+              <w:rPr>
+                <w:sz w:val="24"/>
+                <w:szCs w:val="24"/>
+              </w:rPr>
+              <w:t>documents</w:t>
+            </w:r>
+            <w:proofErr w:type="spellEnd"/>
+            <w:r>
+              <w:rPr>
+                <w:sz w:val="24"/>
+                <w:szCs w:val="24"/>
+              </w:rPr>
+              <w:t>(</w:t>
+            </w:r>
+            <w:proofErr w:type="gramEnd"/>
+            <w:r>
+              <w:rPr>
+                <w:sz w:val="24"/>
+                <w:szCs w:val="24"/>
+              </w:rPr>
+              <w:br/>
+            </w:r>
+            <w:r>
+              <w:rPr>
+                <w:sz w:val="24"/>
+                <w:szCs w:val="24"/>
+              </w:rPr>
+              <w:t>        documents,</w:t>
+            </w:r>
+            <w:r>
+              <w:rPr>
+                <w:sz w:val="24"/>
+                <w:szCs w:val="24"/>
+              </w:rPr>
+              <w:br/>
+            </w:r>
+            <w:r>
+              <w:rPr>
+                <w:sz w:val="24"/>
+                <w:szCs w:val="24"/>
+              </w:rPr>
+              <w:t xml:space="preserve">        </w:t>
+            </w:r>
+            <w:proofErr w:type="spellStart"/>
+            <w:r>
+              <w:rPr>
+                <w:sz w:val="24"/>
+                <w:szCs w:val="24"/>
+              </w:rPr>
+              <w:t>get_</w:t>
+            </w:r>
+            <w:proofErr w:type="gramStart"/>
+            <w:r>
+              <w:rPr>
+                <w:sz w:val="24"/>
+                <w:szCs w:val="24"/>
+              </w:rPr>
+              <w:t>embeddings</w:t>
+            </w:r>
+            <w:proofErr w:type="spellEnd"/>
+            <w:r>
+              <w:rPr>
+                <w:sz w:val="24"/>
+                <w:szCs w:val="24"/>
+              </w:rPr>
+              <w:t>(</w:t>
+            </w:r>
+            <w:proofErr w:type="gramEnd"/>
+            <w:r>
+              <w:rPr>
+                <w:sz w:val="24"/>
+                <w:szCs w:val="24"/>
+              </w:rPr>
+              <w:t>),</w:t>
+            </w:r>
+            <w:r>
+              <w:rPr>
+                <w:sz w:val="24"/>
+                <w:szCs w:val="24"/>
+              </w:rPr>
+              <w:br/>
+            </w:r>
+            <w:r>
+              <w:rPr>
+                <w:sz w:val="24"/>
+                <w:szCs w:val="24"/>
+              </w:rPr>
+              <w:t xml:space="preserve">        </w:t>
+            </w:r>
+            <w:proofErr w:type="spellStart"/>
+            <w:r>
+              <w:rPr>
+                <w:sz w:val="24"/>
+                <w:szCs w:val="24"/>
+              </w:rPr>
+              <w:t>persist_directory</w:t>
+            </w:r>
+            <w:proofErr w:type="spellEnd"/>
+            <w:r>
+              <w:rPr>
+                <w:sz w:val="24"/>
+                <w:szCs w:val="24"/>
+              </w:rPr>
+              <w:t>=WIKIPEDIA_CHROMA_DIR,</w:t>
+            </w:r>
+            <w:r>
+              <w:rPr>
+                <w:sz w:val="24"/>
+                <w:szCs w:val="24"/>
+              </w:rPr>
+              <w:br/>
+            </w:r>
+            <w:r>
+              <w:rPr>
+                <w:sz w:val="24"/>
+                <w:szCs w:val="24"/>
+              </w:rPr>
+              <w:t xml:space="preserve">  </w:t>
+            </w:r>
+            <w:proofErr w:type="gramStart"/>
+            <w:r>
+              <w:rPr>
+                <w:sz w:val="24"/>
+                <w:szCs w:val="24"/>
+              </w:rPr>
+              <w:t>  )</w:t>
+            </w:r>
+            <w:proofErr w:type="gramEnd"/>
+            <w:r>
+              <w:rPr>
+                <w:sz w:val="24"/>
+                <w:szCs w:val="24"/>
+              </w:rPr>
+              <w:br/>
+            </w:r>
+            <w:r>
+              <w:rPr>
+                <w:sz w:val="24"/>
+                <w:szCs w:val="24"/>
+              </w:rPr>
+              <w:t xml:space="preserve">    </w:t>
+            </w:r>
+            <w:proofErr w:type="gramStart"/>
+            <w:r>
+              <w:rPr>
+                <w:sz w:val="24"/>
+                <w:szCs w:val="24"/>
+              </w:rPr>
+              <w:t>print(</w:t>
+            </w:r>
+            <w:proofErr w:type="spellStart"/>
+            <w:proofErr w:type="gramEnd"/>
+            <w:r>
+              <w:rPr>
+                <w:sz w:val="24"/>
+                <w:szCs w:val="24"/>
+              </w:rPr>
+              <w:t>f"Indexed</w:t>
+            </w:r>
+            <w:proofErr w:type="spellEnd"/>
+            <w:r>
+              <w:rPr>
+                <w:sz w:val="24"/>
+                <w:szCs w:val="24"/>
+              </w:rPr>
+              <w:t xml:space="preserve"> {</w:t>
+            </w:r>
+            <w:proofErr w:type="spellStart"/>
+            <w:r>
+              <w:rPr>
+                <w:sz w:val="24"/>
+                <w:szCs w:val="24"/>
+              </w:rPr>
+              <w:t>len</w:t>
+            </w:r>
+            <w:proofErr w:type="spellEnd"/>
+            <w:r>
+              <w:rPr>
+                <w:sz w:val="24"/>
+                <w:szCs w:val="24"/>
+              </w:rPr>
+              <w:t>(documents)} Wikipedia articles.")</w:t>
+            </w:r>
+            <w:r>
+              <w:rPr>
+                <w:sz w:val="24"/>
+                <w:szCs w:val="24"/>
+              </w:rPr>
+              <w:br/>
+            </w:r>
+            <w:r>
+              <w:rPr>
+                <w:sz w:val="24"/>
+                <w:szCs w:val="24"/>
+              </w:rPr>
+              <w:t xml:space="preserve">    return </w:t>
+            </w:r>
+            <w:proofErr w:type="spellStart"/>
+            <w:r>
+              <w:rPr>
+                <w:sz w:val="24"/>
+                <w:szCs w:val="24"/>
+              </w:rPr>
+              <w:t>db</w:t>
+            </w:r>
+            <w:proofErr w:type="spellEnd"/>
           </w:p>
           <w:p>
             <w:pPr>
@@ -816,6 +1810,687 @@
                 <w:szCs w:val="24"/>
               </w:rPr>
             </w:pPr>
+            <w:r>
+              <w:rPr>
+                <w:sz w:val="24"/>
+                <w:szCs w:val="24"/>
+              </w:rPr>
+              <w:t>And I extracted the text from the Wikipedia articles using this call:</w:t>
+            </w:r>
+            <w:r>
+              <w:rPr>
+                <w:sz w:val="24"/>
+                <w:szCs w:val="24"/>
+              </w:rPr>
+              <w:br/>
+            </w:r>
+            <w:r>
+              <w:rPr>
+                <w:sz w:val="24"/>
+                <w:szCs w:val="24"/>
+              </w:rPr>
+              <w:t xml:space="preserve">WIKIPEDIA_DOCS = </w:t>
+            </w:r>
+            <w:proofErr w:type="spellStart"/>
+            <w:r>
+              <w:rPr>
+                <w:sz w:val="24"/>
+                <w:szCs w:val="24"/>
+              </w:rPr>
+              <w:t>extract_wikipedia_</w:t>
+            </w:r>
+            <w:proofErr w:type="gramStart"/>
+            <w:r>
+              <w:rPr>
+                <w:sz w:val="24"/>
+                <w:szCs w:val="24"/>
+              </w:rPr>
+              <w:t>text</w:t>
+            </w:r>
+            <w:proofErr w:type="spellEnd"/>
+            <w:r>
+              <w:rPr>
+                <w:sz w:val="24"/>
+                <w:szCs w:val="24"/>
+              </w:rPr>
+              <w:t>(</w:t>
+            </w:r>
+            <w:proofErr w:type="gramEnd"/>
+            <w:r>
+              <w:rPr>
+                <w:sz w:val="24"/>
+                <w:szCs w:val="24"/>
+              </w:rPr>
+              <w:t>WIKIPEDIA_DIR)</w:t>
+            </w:r>
+          </w:p>
+          <w:p>
+            <w:pPr>
+              <w:spacing w:after="120"/>
+              <w:rPr>
+                <w:sz w:val="24"/>
+                <w:szCs w:val="24"/>
+              </w:rPr>
+            </w:pPr>
+            <w:r>
+              <w:rPr>
+                <w:sz w:val="24"/>
+                <w:szCs w:val="24"/>
+              </w:rPr>
+              <w:t>And this basic function:</w:t>
+            </w:r>
+            <w:r>
+              <w:rPr>
+                <w:sz w:val="24"/>
+                <w:szCs w:val="24"/>
+              </w:rPr>
+              <w:br/>
+            </w:r>
+            <w:r>
+              <w:rPr>
+                <w:sz w:val="24"/>
+                <w:szCs w:val="24"/>
+              </w:rPr>
+              <w:br/>
+            </w:r>
+            <w:r>
+              <w:rPr>
+                <w:sz w:val="24"/>
+                <w:szCs w:val="24"/>
+              </w:rPr>
+              <w:lastRenderedPageBreak/>
+              <w:t xml:space="preserve">def </w:t>
+            </w:r>
+            <w:proofErr w:type="spellStart"/>
+            <w:r>
+              <w:rPr>
+                <w:sz w:val="24"/>
+                <w:szCs w:val="24"/>
+              </w:rPr>
+              <w:t>extract_wikipedia_</w:t>
+            </w:r>
+            <w:proofErr w:type="gramStart"/>
+            <w:r>
+              <w:rPr>
+                <w:sz w:val="24"/>
+                <w:szCs w:val="24"/>
+              </w:rPr>
+              <w:t>text</w:t>
+            </w:r>
+            <w:proofErr w:type="spellEnd"/>
+            <w:r>
+              <w:rPr>
+                <w:sz w:val="24"/>
+                <w:szCs w:val="24"/>
+              </w:rPr>
+              <w:t>(</w:t>
+            </w:r>
+            <w:proofErr w:type="spellStart"/>
+            <w:proofErr w:type="gramEnd"/>
+            <w:r>
+              <w:rPr>
+                <w:sz w:val="24"/>
+                <w:szCs w:val="24"/>
+              </w:rPr>
+              <w:t>directory_path</w:t>
+            </w:r>
+            <w:proofErr w:type="spellEnd"/>
+            <w:r>
+              <w:rPr>
+                <w:sz w:val="24"/>
+                <w:szCs w:val="24"/>
+              </w:rPr>
+              <w:t xml:space="preserve">: str) -&gt; </w:t>
+            </w:r>
+            <w:proofErr w:type="gramStart"/>
+            <w:r>
+              <w:rPr>
+                <w:sz w:val="24"/>
+                <w:szCs w:val="24"/>
+              </w:rPr>
+              <w:t>list[tuple[</w:t>
+            </w:r>
+            <w:proofErr w:type="gramEnd"/>
+            <w:r>
+              <w:rPr>
+                <w:sz w:val="24"/>
+                <w:szCs w:val="24"/>
+              </w:rPr>
+              <w:t>str, str]]:</w:t>
+            </w:r>
+            <w:r>
+              <w:rPr>
+                <w:sz w:val="24"/>
+                <w:szCs w:val="24"/>
+              </w:rPr>
+              <w:br/>
+            </w:r>
+            <w:r>
+              <w:rPr>
+                <w:sz w:val="24"/>
+                <w:szCs w:val="24"/>
+              </w:rPr>
+              <w:t>    """Return the filename and extracted main text for each HTML file."""</w:t>
+            </w:r>
+            <w:r>
+              <w:rPr>
+                <w:sz w:val="24"/>
+                <w:szCs w:val="24"/>
+              </w:rPr>
+              <w:br/>
+            </w:r>
+            <w:r>
+              <w:rPr>
+                <w:sz w:val="24"/>
+                <w:szCs w:val="24"/>
+              </w:rPr>
+              <w:t>    articles = []</w:t>
+            </w:r>
+            <w:r>
+              <w:rPr>
+                <w:sz w:val="24"/>
+                <w:szCs w:val="24"/>
+              </w:rPr>
+              <w:br/>
+            </w:r>
+            <w:r>
+              <w:rPr>
+                <w:sz w:val="24"/>
+                <w:szCs w:val="24"/>
+              </w:rPr>
+              <w:t>    for filename in sorted(</w:t>
+            </w:r>
+            <w:proofErr w:type="spellStart"/>
+            <w:proofErr w:type="gramStart"/>
+            <w:r>
+              <w:rPr>
+                <w:sz w:val="24"/>
+                <w:szCs w:val="24"/>
+              </w:rPr>
+              <w:t>os.listdir</w:t>
+            </w:r>
+            <w:proofErr w:type="spellEnd"/>
+            <w:proofErr w:type="gramEnd"/>
+            <w:r>
+              <w:rPr>
+                <w:sz w:val="24"/>
+                <w:szCs w:val="24"/>
+              </w:rPr>
+              <w:t>(</w:t>
+            </w:r>
+            <w:proofErr w:type="spellStart"/>
+            <w:r>
+              <w:rPr>
+                <w:sz w:val="24"/>
+                <w:szCs w:val="24"/>
+              </w:rPr>
+              <w:t>directory_path</w:t>
+            </w:r>
+            <w:proofErr w:type="spellEnd"/>
+            <w:r>
+              <w:rPr>
+                <w:sz w:val="24"/>
+                <w:szCs w:val="24"/>
+              </w:rPr>
+              <w:t>)):</w:t>
+            </w:r>
+            <w:r>
+              <w:rPr>
+                <w:sz w:val="24"/>
+                <w:szCs w:val="24"/>
+              </w:rPr>
+              <w:br/>
+            </w:r>
+            <w:r>
+              <w:rPr>
+                <w:sz w:val="24"/>
+                <w:szCs w:val="24"/>
+              </w:rPr>
+              <w:t xml:space="preserve">        if not </w:t>
+            </w:r>
+            <w:proofErr w:type="spellStart"/>
+            <w:proofErr w:type="gramStart"/>
+            <w:r>
+              <w:rPr>
+                <w:sz w:val="24"/>
+                <w:szCs w:val="24"/>
+              </w:rPr>
+              <w:t>filename.endswith</w:t>
+            </w:r>
+            <w:proofErr w:type="spellEnd"/>
+            <w:proofErr w:type="gramEnd"/>
+            <w:r>
+              <w:rPr>
+                <w:sz w:val="24"/>
+                <w:szCs w:val="24"/>
+              </w:rPr>
+              <w:t>(".html"):</w:t>
+            </w:r>
+            <w:r>
+              <w:rPr>
+                <w:sz w:val="24"/>
+                <w:szCs w:val="24"/>
+              </w:rPr>
+              <w:br/>
+            </w:r>
+            <w:r>
+              <w:rPr>
+                <w:sz w:val="24"/>
+                <w:szCs w:val="24"/>
+              </w:rPr>
+              <w:t>            continue</w:t>
+            </w:r>
+          </w:p>
+          <w:p>
+            <w:pPr>
+              <w:spacing w:after="120"/>
+              <w:rPr>
+                <w:sz w:val="24"/>
+                <w:szCs w:val="24"/>
+              </w:rPr>
+            </w:pPr>
+            <w:r>
+              <w:rPr>
+                <w:sz w:val="24"/>
+                <w:szCs w:val="24"/>
+              </w:rPr>
+              <w:t xml:space="preserve">        </w:t>
+            </w:r>
+            <w:proofErr w:type="spellStart"/>
+            <w:r>
+              <w:rPr>
+                <w:sz w:val="24"/>
+                <w:szCs w:val="24"/>
+              </w:rPr>
+              <w:t>file_path</w:t>
+            </w:r>
+            <w:proofErr w:type="spellEnd"/>
+            <w:r>
+              <w:rPr>
+                <w:sz w:val="24"/>
+                <w:szCs w:val="24"/>
+              </w:rPr>
+              <w:t xml:space="preserve"> = </w:t>
+            </w:r>
+            <w:proofErr w:type="spellStart"/>
+            <w:proofErr w:type="gramStart"/>
+            <w:r>
+              <w:rPr>
+                <w:sz w:val="24"/>
+                <w:szCs w:val="24"/>
+              </w:rPr>
+              <w:t>os.path</w:t>
+            </w:r>
+            <w:proofErr w:type="gramEnd"/>
+            <w:r>
+              <w:rPr>
+                <w:sz w:val="24"/>
+                <w:szCs w:val="24"/>
+              </w:rPr>
+              <w:t>.</w:t>
+            </w:r>
+            <w:proofErr w:type="gramStart"/>
+            <w:r>
+              <w:rPr>
+                <w:sz w:val="24"/>
+                <w:szCs w:val="24"/>
+              </w:rPr>
+              <w:t>join</w:t>
+            </w:r>
+            <w:proofErr w:type="spellEnd"/>
+            <w:r>
+              <w:rPr>
+                <w:sz w:val="24"/>
+                <w:szCs w:val="24"/>
+              </w:rPr>
+              <w:t>(</w:t>
+            </w:r>
+            <w:proofErr w:type="spellStart"/>
+            <w:proofErr w:type="gramEnd"/>
+            <w:r>
+              <w:rPr>
+                <w:sz w:val="24"/>
+                <w:szCs w:val="24"/>
+              </w:rPr>
+              <w:t>directory_path</w:t>
+            </w:r>
+            <w:proofErr w:type="spellEnd"/>
+            <w:r>
+              <w:rPr>
+                <w:sz w:val="24"/>
+                <w:szCs w:val="24"/>
+              </w:rPr>
+              <w:t>, filename)</w:t>
+            </w:r>
+            <w:r>
+              <w:rPr>
+                <w:sz w:val="24"/>
+                <w:szCs w:val="24"/>
+              </w:rPr>
+              <w:br/>
+            </w:r>
+            <w:r>
+              <w:rPr>
+                <w:sz w:val="24"/>
+                <w:szCs w:val="24"/>
+              </w:rPr>
+              <w:t>        try:</w:t>
+            </w:r>
+            <w:r>
+              <w:rPr>
+                <w:sz w:val="24"/>
+                <w:szCs w:val="24"/>
+              </w:rPr>
+              <w:br/>
+            </w:r>
+            <w:r>
+              <w:rPr>
+                <w:sz w:val="24"/>
+                <w:szCs w:val="24"/>
+              </w:rPr>
+              <w:t xml:space="preserve">            with </w:t>
+            </w:r>
+            <w:proofErr w:type="gramStart"/>
+            <w:r>
+              <w:rPr>
+                <w:sz w:val="24"/>
+                <w:szCs w:val="24"/>
+              </w:rPr>
+              <w:t>open(</w:t>
+            </w:r>
+            <w:proofErr w:type="spellStart"/>
+            <w:proofErr w:type="gramEnd"/>
+            <w:r>
+              <w:rPr>
+                <w:sz w:val="24"/>
+                <w:szCs w:val="24"/>
+              </w:rPr>
+              <w:t>file_path</w:t>
+            </w:r>
+            <w:proofErr w:type="spellEnd"/>
+            <w:r>
+              <w:rPr>
+                <w:sz w:val="24"/>
+                <w:szCs w:val="24"/>
+              </w:rPr>
+              <w:t>, "r", encoding="utf-8") as file:</w:t>
+            </w:r>
+            <w:r>
+              <w:rPr>
+                <w:sz w:val="24"/>
+                <w:szCs w:val="24"/>
+              </w:rPr>
+              <w:br/>
+            </w:r>
+            <w:r>
+              <w:rPr>
+                <w:sz w:val="24"/>
+                <w:szCs w:val="24"/>
+              </w:rPr>
+              <w:t xml:space="preserve">                </w:t>
+            </w:r>
+            <w:proofErr w:type="spellStart"/>
+            <w:r>
+              <w:rPr>
+                <w:sz w:val="24"/>
+                <w:szCs w:val="24"/>
+              </w:rPr>
+              <w:t>html_content</w:t>
+            </w:r>
+            <w:proofErr w:type="spellEnd"/>
+            <w:r>
+              <w:rPr>
+                <w:sz w:val="24"/>
+                <w:szCs w:val="24"/>
+              </w:rPr>
+              <w:t xml:space="preserve"> = </w:t>
+            </w:r>
+            <w:proofErr w:type="spellStart"/>
+            <w:proofErr w:type="gramStart"/>
+            <w:r>
+              <w:rPr>
+                <w:sz w:val="24"/>
+                <w:szCs w:val="24"/>
+              </w:rPr>
+              <w:t>file.read</w:t>
+            </w:r>
+            <w:proofErr w:type="spellEnd"/>
+            <w:proofErr w:type="gramEnd"/>
+            <w:r>
+              <w:rPr>
+                <w:sz w:val="24"/>
+                <w:szCs w:val="24"/>
+              </w:rPr>
+              <w:t>()</w:t>
+            </w:r>
+            <w:r>
+              <w:rPr>
+                <w:sz w:val="24"/>
+                <w:szCs w:val="24"/>
+              </w:rPr>
+              <w:br/>
+            </w:r>
+            <w:r>
+              <w:rPr>
+                <w:sz w:val="24"/>
+                <w:szCs w:val="24"/>
+              </w:rPr>
+              <w:t xml:space="preserve">            text = </w:t>
+            </w:r>
+            <w:proofErr w:type="spellStart"/>
+            <w:proofErr w:type="gramStart"/>
+            <w:r>
+              <w:rPr>
+                <w:sz w:val="24"/>
+                <w:szCs w:val="24"/>
+              </w:rPr>
+              <w:t>trafilatura.extract</w:t>
+            </w:r>
+            <w:proofErr w:type="spellEnd"/>
+            <w:proofErr w:type="gramEnd"/>
+            <w:r>
+              <w:rPr>
+                <w:sz w:val="24"/>
+                <w:szCs w:val="24"/>
+              </w:rPr>
+              <w:t>(</w:t>
+            </w:r>
+            <w:proofErr w:type="spellStart"/>
+            <w:r>
+              <w:rPr>
+                <w:sz w:val="24"/>
+                <w:szCs w:val="24"/>
+              </w:rPr>
+              <w:t>html_content</w:t>
+            </w:r>
+            <w:proofErr w:type="spellEnd"/>
+            <w:r>
+              <w:rPr>
+                <w:sz w:val="24"/>
+                <w:szCs w:val="24"/>
+              </w:rPr>
+              <w:t>)</w:t>
+            </w:r>
+            <w:r>
+              <w:rPr>
+                <w:sz w:val="24"/>
+                <w:szCs w:val="24"/>
+              </w:rPr>
+              <w:br/>
+            </w:r>
+            <w:r>
+              <w:rPr>
+                <w:sz w:val="24"/>
+                <w:szCs w:val="24"/>
+              </w:rPr>
+              <w:t>            if text:</w:t>
+            </w:r>
+            <w:r>
+              <w:rPr>
+                <w:sz w:val="24"/>
+                <w:szCs w:val="24"/>
+              </w:rPr>
+              <w:br/>
+            </w:r>
+            <w:r>
+              <w:rPr>
+                <w:sz w:val="24"/>
+                <w:szCs w:val="24"/>
+              </w:rPr>
+              <w:t xml:space="preserve">                </w:t>
+            </w:r>
+            <w:proofErr w:type="spellStart"/>
+            <w:proofErr w:type="gramStart"/>
+            <w:r>
+              <w:rPr>
+                <w:sz w:val="24"/>
+                <w:szCs w:val="24"/>
+              </w:rPr>
+              <w:t>articles.append</w:t>
+            </w:r>
+            <w:proofErr w:type="spellEnd"/>
+            <w:proofErr w:type="gramEnd"/>
+            <w:r>
+              <w:rPr>
+                <w:sz w:val="24"/>
+                <w:szCs w:val="24"/>
+              </w:rPr>
+              <w:t>((filename, text))</w:t>
+            </w:r>
+            <w:r>
+              <w:rPr>
+                <w:sz w:val="24"/>
+                <w:szCs w:val="24"/>
+              </w:rPr>
+              <w:br/>
+            </w:r>
+            <w:r>
+              <w:rPr>
+                <w:sz w:val="24"/>
+                <w:szCs w:val="24"/>
+              </w:rPr>
+              <w:t>        except Exception as error:</w:t>
+            </w:r>
+            <w:r>
+              <w:rPr>
+                <w:sz w:val="24"/>
+                <w:szCs w:val="24"/>
+              </w:rPr>
+              <w:br/>
+            </w:r>
+            <w:r>
+              <w:rPr>
+                <w:sz w:val="24"/>
+                <w:szCs w:val="24"/>
+              </w:rPr>
+              <w:t xml:space="preserve">            </w:t>
+            </w:r>
+            <w:proofErr w:type="gramStart"/>
+            <w:r>
+              <w:rPr>
+                <w:sz w:val="24"/>
+                <w:szCs w:val="24"/>
+              </w:rPr>
+              <w:t>print(</w:t>
+            </w:r>
+            <w:proofErr w:type="spellStart"/>
+            <w:proofErr w:type="gramEnd"/>
+            <w:r>
+              <w:rPr>
+                <w:sz w:val="24"/>
+                <w:szCs w:val="24"/>
+              </w:rPr>
+              <w:t>f"Failed</w:t>
+            </w:r>
+            <w:proofErr w:type="spellEnd"/>
+            <w:r>
+              <w:rPr>
+                <w:sz w:val="24"/>
+                <w:szCs w:val="24"/>
+              </w:rPr>
+              <w:t xml:space="preserve"> to extract {filename}: {error}")</w:t>
+            </w:r>
+            <w:r>
+              <w:rPr>
+                <w:sz w:val="24"/>
+                <w:szCs w:val="24"/>
+              </w:rPr>
+              <w:br/>
+            </w:r>
+            <w:r>
+              <w:rPr>
+                <w:sz w:val="24"/>
+                <w:szCs w:val="24"/>
+              </w:rPr>
+              <w:t>    return articles</w:t>
+            </w:r>
+          </w:p>
+          <w:p>
+            <w:pPr>
+              <w:spacing w:after="120"/>
+              <w:rPr>
+                <w:sz w:val="24"/>
+                <w:szCs w:val="24"/>
+              </w:rPr>
+            </w:pPr>
+            <w:r>
+              <w:rPr>
+                <w:sz w:val="24"/>
+                <w:szCs w:val="24"/>
+              </w:rPr>
+              <w:t xml:space="preserve">The Python script is </w:t>
+            </w:r>
+            <w:hyperlink r:id="rId9" w:history="1">
+              <w:r>
+                <w:rPr>
+                  <w:rStyle w:val="Hyperlink"/>
+                  <w:sz w:val="24"/>
+                  <w:szCs w:val="24"/>
+                </w:rPr>
+                <w:t>https://github.com/scampb06/MIT_RAG_Capstone/blob/master/Checkpoint%202.1/capstone_checkpoint_2_1_baseline_retrieval_solution.py</w:t>
+              </w:r>
+            </w:hyperlink>
+            <w:r>
+              <w:rPr>
+                <w:sz w:val="24"/>
+                <w:szCs w:val="24"/>
+              </w:rPr>
+              <w:t xml:space="preserve">. The helper text extract is </w:t>
+            </w:r>
+            <w:hyperlink r:id="rId10" w:history="1">
+              <w:r>
+                <w:rPr>
+                  <w:rStyle w:val="Hyperlink"/>
+                  <w:sz w:val="24"/>
+                  <w:szCs w:val="24"/>
+                </w:rPr>
+                <w:t>https://github.com/scampb06/MIT_RAG_Capstone/blob/master/Checkpoint%202.1/Extract_text_from_wikis.py</w:t>
+              </w:r>
+            </w:hyperlink>
+            <w:r>
+              <w:rPr>
+                <w:sz w:val="24"/>
+                <w:szCs w:val="24"/>
+              </w:rPr>
+              <w:t xml:space="preserve">. The retrieval log file is </w:t>
+            </w:r>
+            <w:hyperlink r:id="rId11" w:history="1">
+              <w:r>
+                <w:rPr>
+                  <w:rStyle w:val="Hyperlink"/>
+                  <w:sz w:val="24"/>
+                  <w:szCs w:val="24"/>
+                </w:rPr>
+                <w:t>https://github.com/scampb06/MIT_RAG_Capstone/blob/master/Checkpoint%202.1/checkpoint_2_1_retrieval.log</w:t>
+              </w:r>
+            </w:hyperlink>
+            <w:r>
+              <w:rPr>
+                <w:sz w:val="24"/>
+                <w:szCs w:val="24"/>
+              </w:rPr>
+              <w:t xml:space="preserve">. </w:t>
+            </w:r>
           </w:p>
         </w:tc>
       </w:tr>
@@ -901,7 +2576,27 @@
           <w:sz w:val="24"/>
           <w:szCs w:val="24"/>
         </w:rPr>
-        <w:t xml:space="preserve">Focus on showing how the retrieval system behaves across different types of information needs. Where possible, include a mix of precise, conceptual, or broader exploratory queries. </w:t>
+        <w:t xml:space="preserve">Focus on showing how the retrieval system behaves across different types of information needs. Where possible, include a mix of precise, conceptual, or broader </w:t>
+      </w:r>
+      <w:proofErr w:type="gramStart"/>
+      <w:r>
+        <w:rPr>
+          <w:rFonts w:eastAsia="Aptos"/>
+          <w:color w:val="000000"/>
+          <w:sz w:val="24"/>
+          <w:szCs w:val="24"/>
+        </w:rPr>
+        <w:t>exploratory</w:t>
+      </w:r>
+      <w:proofErr w:type="gramEnd"/>
+      <w:r>
+        <w:rPr>
+          <w:rFonts w:eastAsia="Aptos"/>
+          <w:color w:val="000000"/>
+          <w:sz w:val="24"/>
+          <w:szCs w:val="24"/>
+        </w:rPr>
+        <w:t xml:space="preserve"> queries. </w:t>
       </w:r>
     </w:p>
     <w:tbl>
@@ -976,6 +2671,20 @@
               </w:rPr>
               <w:t>Query:</w:t>
             </w:r>
+            <w:r>
+              <w:rPr>
+                <w:sz w:val="24"/>
+                <w:szCs w:val="24"/>
+              </w:rPr>
+              <w:t xml:space="preserve"> </w:t>
+            </w:r>
+            <w:r>
+              <w:rPr>
+                <w:sz w:val="24"/>
+                <w:szCs w:val="24"/>
+              </w:rPr>
+              <w:t>A major Japanese disaster in 2011 slightly accelerated the planet's rotation. By how much did it shorten each day?</w:t>
+            </w:r>
           </w:p>
           <w:p>
             <w:pPr>
@@ -984,6 +2693,60 @@
                 <w:szCs w:val="24"/>
               </w:rPr>
             </w:pPr>
+            <w:r>
+              <w:rPr>
+                <w:sz w:val="24"/>
+                <w:szCs w:val="24"/>
+              </w:rPr>
+              <w:lastRenderedPageBreak/>
+              <w:t>Retrieved results:</w:t>
+            </w:r>
+            <w:r>
+              <w:rPr>
+                <w:sz w:val="24"/>
+                <w:szCs w:val="24"/>
+              </w:rPr>
+              <w:t xml:space="preserve"> </w:t>
+            </w:r>
+            <w:r>
+              <w:rPr>
+                <w:sz w:val="24"/>
+                <w:szCs w:val="24"/>
+              </w:rPr>
+              <w:t xml:space="preserve">The 2011 </w:t>
+            </w:r>
+            <w:proofErr w:type="spellStart"/>
+            <w:r>
+              <w:rPr>
+                <w:sz w:val="24"/>
+                <w:szCs w:val="24"/>
+              </w:rPr>
+              <w:t>Tōhoku</w:t>
+            </w:r>
+            <w:proofErr w:type="spellEnd"/>
+            <w:r>
+              <w:rPr>
+                <w:sz w:val="24"/>
+                <w:szCs w:val="24"/>
+              </w:rPr>
+              <w:t xml:space="preserve"> earthquake and tsunami “increased Earth’s rotational speed by **1.8 </w:t>
+            </w:r>
+            <w:proofErr w:type="spellStart"/>
+            <w:r>
+              <w:rPr>
+                <w:sz w:val="24"/>
+                <w:szCs w:val="24"/>
+              </w:rPr>
+              <w:t>μs</w:t>
+            </w:r>
+            <w:proofErr w:type="spellEnd"/>
+            <w:r>
+              <w:rPr>
+                <w:sz w:val="24"/>
+                <w:szCs w:val="24"/>
+              </w:rPr>
+              <w:t xml:space="preserve"> per day**,” and “shorten[ed] the day by **1.8 microseconds**.</w:t>
+            </w:r>
           </w:p>
           <w:p>
             <w:pPr>
@@ -997,30 +2760,6 @@
                 <w:sz w:val="24"/>
                 <w:szCs w:val="24"/>
               </w:rPr>
-              <w:t>Retrieved results:</w:t>
-            </w:r>
-          </w:p>
-          <w:p>
-            <w:pPr>
-              <w:rPr>
-                <w:sz w:val="24"/>
-                <w:szCs w:val="24"/>
-              </w:rPr>
-            </w:pPr>
-          </w:p>
-          <w:p>
-            <w:pPr>
-              <w:rPr>
-                <w:sz w:val="24"/>
-                <w:szCs w:val="24"/>
-              </w:rPr>
-            </w:pPr>
-            <w:r>
-              <w:rPr>
-                <w:sz w:val="24"/>
-                <w:szCs w:val="24"/>
-              </w:rPr>
-              <w:lastRenderedPageBreak/>
               <w:t>Observations:</w:t>
             </w:r>
           </w:p>
@@ -1048,15 +2787,13 @@
                 <w:szCs w:val="24"/>
               </w:rPr>
             </w:pPr>
-          </w:p>
-          <w:p>
-            <w:pPr>
-              <w:spacing w:after="120"/>
-              <w:rPr>
-                <w:sz w:val="24"/>
-                <w:szCs w:val="24"/>
-              </w:rPr>
-            </w:pPr>
+            <w:r>
+              <w:rPr>
+                <w:sz w:val="24"/>
+                <w:szCs w:val="24"/>
+              </w:rPr>
+              <w:t xml:space="preserve">This example shows strong retrieval when only one single article is required to answer the question. </w:t>
+            </w:r>
           </w:p>
         </w:tc>
       </w:tr>
@@ -1141,6 +2878,20 @@
               </w:rPr>
               <w:t>Query:</w:t>
             </w:r>
+            <w:r>
+              <w:rPr>
+                <w:sz w:val="24"/>
+                <w:szCs w:val="24"/>
+              </w:rPr>
+              <w:t xml:space="preserve"> </w:t>
+            </w:r>
+            <w:r>
+              <w:rPr>
+                <w:sz w:val="24"/>
+                <w:szCs w:val="24"/>
+              </w:rPr>
+              <w:t>Compare the Academy Awards ceremonies held a decade apart: who hosted the 85th and 95th ceremonies, and which film won Best Picture at each?</w:t>
+            </w:r>
           </w:p>
           <w:p>
             <w:pPr>
@@ -1149,6 +2900,43 @@
                 <w:szCs w:val="24"/>
               </w:rPr>
             </w:pPr>
+            <w:r>
+              <w:rPr>
+                <w:sz w:val="24"/>
+                <w:szCs w:val="24"/>
+              </w:rPr>
+              <w:t>Retrieved results:</w:t>
+            </w:r>
+            <w:r>
+              <w:rPr>
+                <w:sz w:val="24"/>
+                <w:szCs w:val="24"/>
+              </w:rPr>
+              <w:t xml:space="preserve"> </w:t>
+            </w:r>
+            <w:r>
+              <w:rPr>
+                <w:sz w:val="24"/>
+                <w:szCs w:val="24"/>
+              </w:rPr>
+              <w:t xml:space="preserve">The provided documents </w:t>
+            </w:r>
+            <w:proofErr w:type="gramStart"/>
+            <w:r>
+              <w:rPr>
+                <w:sz w:val="24"/>
+                <w:szCs w:val="24"/>
+              </w:rPr>
+              <w:t>do **</w:t>
+            </w:r>
+            <w:proofErr w:type="gramEnd"/>
+            <w:r>
+              <w:rPr>
+                <w:sz w:val="24"/>
+                <w:szCs w:val="24"/>
+              </w:rPr>
+              <w:t>not** state who hosted the **85th** or **95th Academy Awards ceremonies**, so I can’t answer that part from the documents.</w:t>
+            </w:r>
           </w:p>
           <w:p>
             <w:pPr>
@@ -1162,7 +2950,7 @@
                 <w:sz w:val="24"/>
                 <w:szCs w:val="24"/>
               </w:rPr>
-              <w:t>Retrieved results:</w:t>
+              <w:t>They do, however, show the **Best Picture winners**:</w:t>
             </w:r>
           </w:p>
           <w:p>
@@ -1172,6 +2960,107 @@
                 <w:szCs w:val="24"/>
               </w:rPr>
             </w:pPr>
+            <w:r>
+              <w:rPr>
+                <w:sz w:val="24"/>
+                <w:szCs w:val="24"/>
+              </w:rPr>
+              <w:t>- **85th Academy Awards (2013</w:t>
+            </w:r>
+            <w:proofErr w:type="gramStart"/>
+            <w:r>
+              <w:rPr>
+                <w:sz w:val="24"/>
+                <w:szCs w:val="24"/>
+              </w:rPr>
+              <w:t>):*</w:t>
+            </w:r>
+            <w:proofErr w:type="gramEnd"/>
+            <w:r>
+              <w:rPr>
+                <w:sz w:val="24"/>
+                <w:szCs w:val="24"/>
+              </w:rPr>
+              <w:t>* The list includes **_12 Years a Slave_** among the Best Picture nominees, but the document excerpt does not explicitly mark the winner in the visible text.</w:t>
+            </w:r>
+          </w:p>
+          <w:p>
+            <w:pPr>
+              <w:rPr>
+                <w:sz w:val="24"/>
+                <w:szCs w:val="24"/>
+              </w:rPr>
+            </w:pPr>
+            <w:r>
+              <w:rPr>
+                <w:sz w:val="24"/>
+                <w:szCs w:val="24"/>
+              </w:rPr>
+              <w:t>- **95th Academy Awards (2023</w:t>
+            </w:r>
+            <w:proofErr w:type="gramStart"/>
+            <w:r>
+              <w:rPr>
+                <w:sz w:val="24"/>
+                <w:szCs w:val="24"/>
+              </w:rPr>
+              <w:t>):*</w:t>
+            </w:r>
+            <w:proofErr w:type="gramEnd"/>
+            <w:r>
+              <w:rPr>
+                <w:sz w:val="24"/>
+                <w:szCs w:val="24"/>
+              </w:rPr>
+              <w:t>* The Best Picture winner was **_Everything Everywhere All at Once_</w:t>
+            </w:r>
+            <w:proofErr w:type="gramStart"/>
+            <w:r>
+              <w:rPr>
+                <w:sz w:val="24"/>
+                <w:szCs w:val="24"/>
+              </w:rPr>
+              <w:t>** —</w:t>
+            </w:r>
+            <w:proofErr w:type="gramEnd"/>
+            <w:r>
+              <w:rPr>
+                <w:sz w:val="24"/>
+                <w:szCs w:val="24"/>
+              </w:rPr>
+              <w:t xml:space="preserve"> the document lists it among the Best Picture </w:t>
+            </w:r>
+            <w:proofErr w:type="gramStart"/>
+            <w:r>
+              <w:rPr>
+                <w:sz w:val="24"/>
+                <w:szCs w:val="24"/>
+              </w:rPr>
+              <w:t>winners</w:t>
+            </w:r>
+            <w:proofErr w:type="gramEnd"/>
+            <w:r>
+              <w:rPr>
+                <w:sz w:val="24"/>
+                <w:szCs w:val="24"/>
+              </w:rPr>
+              <w:t>/nominees section and notes it as a winner in related records.</w:t>
+            </w:r>
+          </w:p>
+          <w:p>
+            <w:pPr>
+              <w:rPr>
+                <w:sz w:val="24"/>
+                <w:szCs w:val="24"/>
+              </w:rPr>
+            </w:pPr>
+            <w:r>
+              <w:rPr>
+                <w:sz w:val="24"/>
+                <w:szCs w:val="24"/>
+              </w:rPr>
+              <w:t>If you want, I can also extract any other details that are explicitly present in the documents.</w:t>
+            </w:r>
           </w:p>
           <w:p>
             <w:pPr>
@@ -1212,6 +3101,185 @@
                 <w:szCs w:val="24"/>
               </w:rPr>
             </w:pPr>
+            <w:r>
+              <w:rPr>
+                <w:sz w:val="24"/>
+                <w:szCs w:val="24"/>
+              </w:rPr>
+              <w:t xml:space="preserve">This time we only got a partial </w:t>
+            </w:r>
+            <w:proofErr w:type="gramStart"/>
+            <w:r>
+              <w:rPr>
+                <w:sz w:val="24"/>
+                <w:szCs w:val="24"/>
+              </w:rPr>
+              <w:t>answer</w:t>
+            </w:r>
+            <w:proofErr w:type="gramEnd"/>
+            <w:r>
+              <w:rPr>
+                <w:sz w:val="24"/>
+                <w:szCs w:val="24"/>
+              </w:rPr>
+              <w:t xml:space="preserve"> but </w:t>
+            </w:r>
+            <w:r>
+              <w:rPr>
+                <w:sz w:val="24"/>
+                <w:szCs w:val="24"/>
+              </w:rPr>
+              <w:t xml:space="preserve">we also </w:t>
+            </w:r>
+            <w:proofErr w:type="gramStart"/>
+            <w:r>
+              <w:rPr>
+                <w:sz w:val="24"/>
+                <w:szCs w:val="24"/>
+              </w:rPr>
+              <w:t>get</w:t>
+            </w:r>
+            <w:proofErr w:type="gramEnd"/>
+            <w:r>
+              <w:rPr>
+                <w:sz w:val="24"/>
+                <w:szCs w:val="24"/>
+              </w:rPr>
+              <w:t xml:space="preserve"> an incorrect statement</w:t>
+            </w:r>
+            <w:r>
+              <w:rPr>
+                <w:sz w:val="24"/>
+                <w:szCs w:val="24"/>
+              </w:rPr>
+              <w:t xml:space="preserve">. The retriever struggled to get detailed information from multiple long documents. The expected answer was for the </w:t>
+            </w:r>
+            <w:r>
+              <w:rPr>
+                <w:sz w:val="24"/>
+                <w:szCs w:val="24"/>
+              </w:rPr>
+              <w:t>85th Seth MacFarlane</w:t>
+            </w:r>
+            <w:r>
+              <w:rPr>
+                <w:sz w:val="24"/>
+                <w:szCs w:val="24"/>
+              </w:rPr>
+              <w:t xml:space="preserve"> hosted and </w:t>
+            </w:r>
+            <w:r>
+              <w:rPr>
+                <w:sz w:val="24"/>
+                <w:szCs w:val="24"/>
+              </w:rPr>
+              <w:t>Argo</w:t>
+            </w:r>
+            <w:r>
+              <w:rPr>
+                <w:sz w:val="24"/>
+                <w:szCs w:val="24"/>
+              </w:rPr>
+              <w:t xml:space="preserve"> won Best Picture, for the </w:t>
+            </w:r>
+            <w:r>
+              <w:rPr>
+                <w:sz w:val="24"/>
+                <w:szCs w:val="24"/>
+              </w:rPr>
+              <w:t>95th Jimmy Kimmel</w:t>
+            </w:r>
+            <w:r>
+              <w:rPr>
+                <w:sz w:val="24"/>
+                <w:szCs w:val="24"/>
+              </w:rPr>
+              <w:t xml:space="preserve"> hosted and </w:t>
+            </w:r>
+            <w:r>
+              <w:rPr>
+                <w:sz w:val="24"/>
+                <w:szCs w:val="24"/>
+              </w:rPr>
+              <w:t>Everything Everywhere All at Once</w:t>
+            </w:r>
+            <w:r>
+              <w:rPr>
+                <w:sz w:val="24"/>
+                <w:szCs w:val="24"/>
+              </w:rPr>
+              <w:t xml:space="preserve"> won Best Picture</w:t>
+            </w:r>
+            <w:r>
+              <w:rPr>
+                <w:sz w:val="24"/>
+                <w:szCs w:val="24"/>
+              </w:rPr>
+              <w:t>.</w:t>
+            </w:r>
+            <w:r>
+              <w:rPr>
+                <w:sz w:val="24"/>
+                <w:szCs w:val="24"/>
+              </w:rPr>
+              <w:t xml:space="preserve"> </w:t>
+            </w:r>
+            <w:r>
+              <w:rPr>
+                <w:sz w:val="24"/>
+                <w:szCs w:val="24"/>
+              </w:rPr>
+              <w:t>The response also incorrectly associated 12 Years a Slave with the 85th Academy Awards. It w</w:t>
+            </w:r>
+            <w:r>
+              <w:rPr>
+                <w:sz w:val="24"/>
+                <w:szCs w:val="24"/>
+              </w:rPr>
+              <w:t>as nominated and it w</w:t>
+            </w:r>
+            <w:r>
+              <w:rPr>
+                <w:sz w:val="24"/>
+                <w:szCs w:val="24"/>
+              </w:rPr>
+              <w:t xml:space="preserve">on Best Picture at the 86th ceremony. </w:t>
+            </w:r>
+            <w:r>
+              <w:rPr>
+                <w:sz w:val="24"/>
+                <w:szCs w:val="24"/>
+              </w:rPr>
+              <w:t xml:space="preserve"> I</w:t>
+            </w:r>
+            <w:r>
+              <w:rPr>
+                <w:sz w:val="24"/>
+                <w:szCs w:val="24"/>
+              </w:rPr>
+              <w:t xml:space="preserve">rrelevant retrieval context </w:t>
+            </w:r>
+            <w:r>
+              <w:rPr>
+                <w:sz w:val="24"/>
+                <w:szCs w:val="24"/>
+              </w:rPr>
+              <w:t xml:space="preserve">likely </w:t>
+            </w:r>
+            <w:r>
+              <w:rPr>
+                <w:sz w:val="24"/>
+                <w:szCs w:val="24"/>
+              </w:rPr>
+              <w:t xml:space="preserve">contributed to </w:t>
+            </w:r>
+            <w:r>
+              <w:rPr>
+                <w:sz w:val="24"/>
+                <w:szCs w:val="24"/>
+              </w:rPr>
+              <w:t>this error.</w:t>
+            </w:r>
           </w:p>
           <w:p>
             <w:pPr>
@@ -1221,6 +3289,91 @@
                 <w:szCs w:val="24"/>
               </w:rPr>
             </w:pPr>
+            <w:r>
+              <w:rPr>
+                <w:sz w:val="24"/>
+                <w:szCs w:val="24"/>
+              </w:rPr>
+              <w:t xml:space="preserve">The retrieval struggled to find the most pertinent articles from a large corpus of articles about awards ceremonies. It chose </w:t>
+            </w:r>
+            <w:r>
+              <w:rPr>
+                <w:sz w:val="24"/>
+                <w:szCs w:val="24"/>
+              </w:rPr>
+              <w:t>Academy_Award_for_Best_Director.html</w:t>
+            </w:r>
+            <w:r>
+              <w:rPr>
+                <w:sz w:val="24"/>
+                <w:szCs w:val="24"/>
+              </w:rPr>
+              <w:t xml:space="preserve">, </w:t>
+            </w:r>
+            <w:r>
+              <w:rPr>
+                <w:sz w:val="24"/>
+                <w:szCs w:val="24"/>
+              </w:rPr>
+              <w:t>Academy_Award_for_Best_Picture.html</w:t>
+            </w:r>
+            <w:r>
+              <w:rPr>
+                <w:sz w:val="24"/>
+                <w:szCs w:val="24"/>
+              </w:rPr>
+              <w:t xml:space="preserve"> and </w:t>
+            </w:r>
+            <w:r>
+              <w:rPr>
+                <w:sz w:val="24"/>
+                <w:szCs w:val="24"/>
+              </w:rPr>
+              <w:t>Academy_Award_for_Best_Actor.html</w:t>
+            </w:r>
+            <w:r>
+              <w:rPr>
+                <w:sz w:val="24"/>
+                <w:szCs w:val="24"/>
+              </w:rPr>
+              <w:t xml:space="preserve"> but really needed </w:t>
+            </w:r>
+            <w:r>
+              <w:rPr>
+                <w:sz w:val="24"/>
+                <w:szCs w:val="24"/>
+              </w:rPr>
+              <w:t>85th_Academy_Awards.html</w:t>
+            </w:r>
+            <w:r>
+              <w:rPr>
+                <w:sz w:val="24"/>
+                <w:szCs w:val="24"/>
+              </w:rPr>
+              <w:t xml:space="preserve"> and </w:t>
+            </w:r>
+            <w:r>
+              <w:rPr>
+                <w:sz w:val="24"/>
+                <w:szCs w:val="24"/>
+              </w:rPr>
+              <w:t>95th_Academy_Awards.html</w:t>
+            </w:r>
+            <w:r>
+              <w:rPr>
+                <w:sz w:val="24"/>
+                <w:szCs w:val="24"/>
+              </w:rPr>
+              <w:t xml:space="preserve"> to get all the details it </w:t>
+            </w:r>
+            <w:r>
+              <w:rPr>
+                <w:sz w:val="24"/>
+                <w:szCs w:val="24"/>
+              </w:rPr>
+              <w:lastRenderedPageBreak/>
+              <w:t xml:space="preserve">needed. The script set TOP_K to 3, which limited the LLM to a context that did not have all the details.  </w:t>
+            </w:r>
           </w:p>
         </w:tc>
       </w:tr>
@@ -1298,6 +3451,20 @@
               </w:rPr>
               <w:t>Query:</w:t>
             </w:r>
+            <w:r>
+              <w:rPr>
+                <w:sz w:val="24"/>
+                <w:szCs w:val="24"/>
+              </w:rPr>
+              <w:t xml:space="preserve"> </w:t>
+            </w:r>
+            <w:r>
+              <w:rPr>
+                <w:sz w:val="24"/>
+                <w:szCs w:val="24"/>
+              </w:rPr>
+              <w:t>For each of the 1996, 2004, and 2008 Summer Olympics, list every city mentioned as having submitted a bid but not winning that edition's hosting contest.</w:t>
+            </w:r>
           </w:p>
           <w:p>
             <w:pPr>
@@ -1306,6 +3473,27 @@
                 <w:szCs w:val="24"/>
               </w:rPr>
             </w:pPr>
+            <w:r>
+              <w:rPr>
+                <w:sz w:val="24"/>
+                <w:szCs w:val="24"/>
+              </w:rPr>
+              <w:t>Retrieved results:</w:t>
+            </w:r>
+            <w:r>
+              <w:rPr>
+                <w:sz w:val="24"/>
+                <w:szCs w:val="24"/>
+              </w:rPr>
+              <w:t xml:space="preserve"> </w:t>
+            </w:r>
+            <w:r>
+              <w:rPr>
+                <w:sz w:val="24"/>
+                <w:szCs w:val="24"/>
+              </w:rPr>
+              <w:t>The documents do **not** provide the cities that submitted losing bids for the **1996, 2004, and 2008 Summer Olympics**.</w:t>
+            </w:r>
           </w:p>
           <w:p>
             <w:pPr>
@@ -1319,7 +3507,7 @@
                 <w:sz w:val="24"/>
                 <w:szCs w:val="24"/>
               </w:rPr>
-              <w:t>Retrieved results:</w:t>
+              <w:t>What the documents do say is only the winning hosts:</w:t>
             </w:r>
           </w:p>
           <w:p>
@@ -1329,6 +3517,72 @@
                 <w:szCs w:val="24"/>
               </w:rPr>
             </w:pPr>
+            <w:r>
+              <w:rPr>
+                <w:sz w:val="24"/>
+                <w:szCs w:val="24"/>
+              </w:rPr>
+              <w:t>- **1996** — “**Atlanta**” was the host.</w:t>
+            </w:r>
+            <w:r>
+              <w:rPr>
+                <w:sz w:val="24"/>
+                <w:szCs w:val="24"/>
+              </w:rPr>
+              <w:br/>
+            </w:r>
+            <w:r>
+              <w:rPr>
+                <w:sz w:val="24"/>
+                <w:szCs w:val="24"/>
+              </w:rPr>
+              <w:t>- **2004** — “**Athens**” was the host.</w:t>
+            </w:r>
+            <w:r>
+              <w:rPr>
+                <w:sz w:val="24"/>
+                <w:szCs w:val="24"/>
+              </w:rPr>
+              <w:br/>
+            </w:r>
+            <w:r>
+              <w:rPr>
+                <w:sz w:val="24"/>
+                <w:szCs w:val="24"/>
+              </w:rPr>
+              <w:t>- **2008** — “**Beijing**” was the host.</w:t>
+            </w:r>
+          </w:p>
+          <w:p>
+            <w:pPr>
+              <w:rPr>
+                <w:sz w:val="24"/>
+                <w:szCs w:val="24"/>
+              </w:rPr>
+            </w:pPr>
+            <w:r>
+              <w:rPr>
+                <w:sz w:val="24"/>
+                <w:szCs w:val="24"/>
+              </w:rPr>
+              <w:t xml:space="preserve">But I do not find in the </w:t>
+            </w:r>
+            <w:proofErr w:type="gramStart"/>
+            <w:r>
+              <w:rPr>
+                <w:sz w:val="24"/>
+                <w:szCs w:val="24"/>
+              </w:rPr>
+              <w:t>provided documents</w:t>
+            </w:r>
+            <w:proofErr w:type="gramEnd"/>
+            <w:r>
+              <w:rPr>
+                <w:sz w:val="24"/>
+                <w:szCs w:val="24"/>
+              </w:rPr>
+              <w:t xml:space="preserve"> a list of the other bid cities for those editions, so I can’t reliably name them without guessing.</w:t>
+            </w:r>
           </w:p>
           <w:p>
             <w:pPr>
@@ -1369,15 +3623,195 @@
                 <w:szCs w:val="24"/>
               </w:rPr>
             </w:pPr>
-          </w:p>
-          <w:p>
-            <w:pPr>
-              <w:spacing w:after="120"/>
-              <w:rPr>
-                <w:sz w:val="24"/>
-                <w:szCs w:val="24"/>
-              </w:rPr>
-            </w:pPr>
+            <w:r>
+              <w:rPr>
+                <w:sz w:val="24"/>
+                <w:szCs w:val="24"/>
+              </w:rPr>
+              <w:t xml:space="preserve">In this case the script failed to provide an answer to the question. To its credit it did not guess but it provided extraneous information which was not requested. </w:t>
+            </w:r>
+            <w:r>
+              <w:rPr>
+                <w:sz w:val="24"/>
+                <w:szCs w:val="24"/>
+              </w:rPr>
+              <w:t xml:space="preserve">The retriever should </w:t>
+            </w:r>
+            <w:r>
+              <w:rPr>
+                <w:sz w:val="24"/>
+                <w:szCs w:val="24"/>
+              </w:rPr>
+              <w:t xml:space="preserve">have </w:t>
+            </w:r>
+            <w:r>
+              <w:rPr>
+                <w:sz w:val="24"/>
+                <w:szCs w:val="24"/>
+              </w:rPr>
+              <w:t>return</w:t>
+            </w:r>
+            <w:r>
+              <w:rPr>
+                <w:sz w:val="24"/>
+                <w:szCs w:val="24"/>
+              </w:rPr>
+              <w:t>ed</w:t>
+            </w:r>
+            <w:r>
+              <w:rPr>
+                <w:sz w:val="24"/>
+                <w:szCs w:val="24"/>
+              </w:rPr>
+              <w:t xml:space="preserve"> </w:t>
+            </w:r>
+            <w:r>
+              <w:rPr>
+                <w:sz w:val="24"/>
+                <w:szCs w:val="24"/>
+              </w:rPr>
+              <w:t xml:space="preserve">the </w:t>
+            </w:r>
+            <w:r>
+              <w:rPr>
+                <w:sz w:val="24"/>
+                <w:szCs w:val="24"/>
+              </w:rPr>
+              <w:t xml:space="preserve">three </w:t>
+            </w:r>
+            <w:r>
+              <w:rPr>
+                <w:sz w:val="24"/>
+                <w:szCs w:val="24"/>
+              </w:rPr>
+              <w:t xml:space="preserve">most relevant </w:t>
+            </w:r>
+            <w:r>
+              <w:rPr>
+                <w:sz w:val="24"/>
+                <w:szCs w:val="24"/>
+              </w:rPr>
+              <w:t>Olympic articles and a complete list of unsuccessful bidding cities.</w:t>
+            </w:r>
+            <w:r>
+              <w:rPr>
+                <w:sz w:val="24"/>
+                <w:szCs w:val="24"/>
+              </w:rPr>
+              <w:t xml:space="preserve"> Again, it failed to retrieve the most relevant documents in its TOP_K=3. It retrieved</w:t>
+            </w:r>
+            <w:r>
+              <w:rPr>
+                <w:sz w:val="24"/>
+                <w:szCs w:val="24"/>
+              </w:rPr>
+              <w:t> 1984_Summer_Olympics.html</w:t>
+            </w:r>
+            <w:r>
+              <w:rPr>
+                <w:sz w:val="24"/>
+                <w:szCs w:val="24"/>
+              </w:rPr>
+              <w:t xml:space="preserve">, </w:t>
+            </w:r>
+            <w:r>
+              <w:rPr>
+                <w:sz w:val="24"/>
+                <w:szCs w:val="24"/>
+              </w:rPr>
+              <w:t>Summer_Olympic_Games.html</w:t>
+            </w:r>
+            <w:r>
+              <w:rPr>
+                <w:sz w:val="24"/>
+                <w:szCs w:val="24"/>
+              </w:rPr>
+              <w:t xml:space="preserve">, and </w:t>
+            </w:r>
+            <w:r>
+              <w:rPr>
+                <w:sz w:val="24"/>
+                <w:szCs w:val="24"/>
+              </w:rPr>
+              <w:t>List_of_Olympic_Games_host_cities.html</w:t>
+            </w:r>
+            <w:r>
+              <w:rPr>
+                <w:sz w:val="24"/>
+                <w:szCs w:val="24"/>
+              </w:rPr>
+              <w:t xml:space="preserve"> due to semantic similarity with the question, but it really needed </w:t>
+            </w:r>
+            <w:r>
+              <w:rPr>
+                <w:sz w:val="24"/>
+                <w:szCs w:val="24"/>
+              </w:rPr>
+              <w:t>1996_Summer_Olympics.html</w:t>
+            </w:r>
+            <w:r>
+              <w:rPr>
+                <w:sz w:val="24"/>
+                <w:szCs w:val="24"/>
+              </w:rPr>
+              <w:t xml:space="preserve">, </w:t>
+            </w:r>
+            <w:r>
+              <w:rPr>
+                <w:sz w:val="24"/>
+                <w:szCs w:val="24"/>
+              </w:rPr>
+              <w:t>2004_Summer_Olympics.html</w:t>
+            </w:r>
+            <w:r>
+              <w:rPr>
+                <w:sz w:val="24"/>
+                <w:szCs w:val="24"/>
+              </w:rPr>
+              <w:t xml:space="preserve">, and </w:t>
+            </w:r>
+            <w:r>
+              <w:rPr>
+                <w:sz w:val="24"/>
+                <w:szCs w:val="24"/>
+              </w:rPr>
+              <w:t>2008_Summer_Olympics.html</w:t>
+            </w:r>
+            <w:r>
+              <w:rPr>
+                <w:sz w:val="24"/>
+                <w:szCs w:val="24"/>
+              </w:rPr>
+              <w:t xml:space="preserve">. It also needed to be able to interpret long tables of text, but the text extractor does not currently handle </w:t>
+            </w:r>
+            <w:r>
+              <w:rPr>
+                <w:sz w:val="24"/>
+                <w:szCs w:val="24"/>
+              </w:rPr>
+              <w:t xml:space="preserve">the structure of </w:t>
+            </w:r>
+            <w:r>
+              <w:rPr>
+                <w:sz w:val="24"/>
+                <w:szCs w:val="24"/>
+              </w:rPr>
+              <w:t>tables explicitly</w:t>
+            </w:r>
+            <w:r>
+              <w:rPr>
+                <w:sz w:val="24"/>
+                <w:szCs w:val="24"/>
+              </w:rPr>
+              <w:t xml:space="preserve"> and TOP_K retrieval may not be adequate to handle an exhaustive answer involving long lists</w:t>
+            </w:r>
+            <w:r>
+              <w:rPr>
+                <w:sz w:val="24"/>
+                <w:szCs w:val="24"/>
+              </w:rPr>
+              <w:t xml:space="preserve">. </w:t>
+            </w:r>
           </w:p>
         </w:tc>
       </w:tr>
@@ -1422,8 +3856,7 @@
                 <w:sz w:val="24"/>
                 <w:szCs w:val="24"/>
               </w:rPr>
-              <w:lastRenderedPageBreak/>
-              <w:t>Optional Additional Queries</w:t>
+              <w:t>Query 4</w:t>
             </w:r>
           </w:p>
         </w:tc>
@@ -1456,6 +3889,20 @@
               </w:rPr>
               <w:t>Query:</w:t>
             </w:r>
+            <w:r>
+              <w:rPr>
+                <w:sz w:val="24"/>
+                <w:szCs w:val="24"/>
+              </w:rPr>
+              <w:t xml:space="preserve"> </w:t>
+            </w:r>
+            <w:r>
+              <w:rPr>
+                <w:sz w:val="24"/>
+                <w:szCs w:val="24"/>
+              </w:rPr>
+              <w:t>In the year Ronald Reagan was first elected U.S. president, which player was the first overall pick in the NFL's college draft, and which team chose him?</w:t>
+            </w:r>
           </w:p>
           <w:p>
             <w:pPr>
@@ -1464,29 +3911,58 @@
                 <w:szCs w:val="24"/>
               </w:rPr>
             </w:pPr>
-          </w:p>
-          <w:p>
-            <w:pPr>
-              <w:rPr>
-                <w:sz w:val="24"/>
-                <w:szCs w:val="24"/>
-              </w:rPr>
-            </w:pPr>
-            <w:r>
-              <w:rPr>
-                <w:sz w:val="24"/>
-                <w:szCs w:val="24"/>
-              </w:rPr>
+            <w:r>
+              <w:rPr>
+                <w:sz w:val="24"/>
+                <w:szCs w:val="24"/>
+              </w:rPr>
+              <w:lastRenderedPageBreak/>
               <w:t>Retrieved results:</w:t>
             </w:r>
-          </w:p>
-          <w:p>
-            <w:pPr>
-              <w:rPr>
-                <w:sz w:val="24"/>
-                <w:szCs w:val="24"/>
-              </w:rPr>
-            </w:pPr>
+            <w:r>
+              <w:rPr>
+                <w:sz w:val="24"/>
+                <w:szCs w:val="24"/>
+              </w:rPr>
+              <w:t xml:space="preserve"> </w:t>
+            </w:r>
+            <w:r>
+              <w:rPr>
+                <w:sz w:val="24"/>
+                <w:szCs w:val="24"/>
+              </w:rPr>
+              <w:t xml:space="preserve">The documents say that in **1980** the first overall pick in the NFL draft was **Billy Sims, a running back**, and he was chosen by the **Detroit Lions**: “**With the first overall pick of the draft, the Detroit Lions selected running back Billy </w:t>
+            </w:r>
+            <w:proofErr w:type="gramStart"/>
+            <w:r>
+              <w:rPr>
+                <w:sz w:val="24"/>
+                <w:szCs w:val="24"/>
+              </w:rPr>
+              <w:t>Sims.*</w:t>
+            </w:r>
+            <w:proofErr w:type="gramEnd"/>
+            <w:r>
+              <w:rPr>
+                <w:sz w:val="24"/>
+                <w:szCs w:val="24"/>
+              </w:rPr>
+              <w:t>*</w:t>
+            </w:r>
+            <w:r>
+              <w:rPr>
+                <w:sz w:val="24"/>
+                <w:szCs w:val="24"/>
+              </w:rPr>
+              <w:br/>
+            </w:r>
+            <w:r>
+              <w:rPr>
+                <w:sz w:val="24"/>
+                <w:szCs w:val="24"/>
+              </w:rPr>
+              <w:t>So, in the year Ronald Reagan was first elected president, the player was **Billy Sims**, and the team was the **Detroit Lions**.</w:t>
+            </w:r>
           </w:p>
           <w:p>
             <w:pPr>
@@ -1521,12 +3997,406 @@
           </w:p>
           <w:p>
             <w:pPr>
-              <w:spacing w:after="120"/>
               <w:rPr>
                 <w:sz w:val="24"/>
                 <w:szCs w:val="24"/>
               </w:rPr>
             </w:pPr>
+            <w:r>
+              <w:rPr>
+                <w:sz w:val="24"/>
+                <w:szCs w:val="24"/>
+              </w:rPr>
+              <w:t xml:space="preserve">The answer here was </w:t>
+            </w:r>
+            <w:proofErr w:type="gramStart"/>
+            <w:r>
+              <w:rPr>
+                <w:sz w:val="24"/>
+                <w:szCs w:val="24"/>
+              </w:rPr>
+              <w:t>actually correct</w:t>
+            </w:r>
+            <w:proofErr w:type="gramEnd"/>
+            <w:r>
+              <w:rPr>
+                <w:sz w:val="24"/>
+                <w:szCs w:val="24"/>
+              </w:rPr>
+              <w:t xml:space="preserve">, but only because the LLM violated the system prompt.  </w:t>
+            </w:r>
+            <w:r>
+              <w:rPr>
+                <w:sz w:val="24"/>
+                <w:szCs w:val="24"/>
+              </w:rPr>
+              <w:t xml:space="preserve">The three retrieved documents (Philadelphia_Eagles.html, 1980_NFL_draft.html, Washington_Commanders.html) contain </w:t>
+            </w:r>
+            <w:r>
+              <w:rPr>
+                <w:sz w:val="24"/>
+                <w:szCs w:val="24"/>
+              </w:rPr>
+              <w:t xml:space="preserve">no </w:t>
+            </w:r>
+            <w:r>
+              <w:rPr>
+                <w:sz w:val="24"/>
+                <w:szCs w:val="24"/>
+              </w:rPr>
+              <w:t>mentions of "Reagan," and Ronald_Reagan.html itself was never retrieved. So</w:t>
+            </w:r>
+            <w:r>
+              <w:rPr>
+                <w:sz w:val="24"/>
+                <w:szCs w:val="24"/>
+              </w:rPr>
+              <w:t>,</w:t>
+            </w:r>
+            <w:r>
+              <w:rPr>
+                <w:sz w:val="24"/>
+                <w:szCs w:val="24"/>
+              </w:rPr>
+              <w:t xml:space="preserve"> the system prompt's "answer using ONLY the </w:t>
+            </w:r>
+            <w:proofErr w:type="gramStart"/>
+            <w:r>
+              <w:rPr>
+                <w:sz w:val="24"/>
+                <w:szCs w:val="24"/>
+              </w:rPr>
+              <w:t>provided documents</w:t>
+            </w:r>
+            <w:proofErr w:type="gramEnd"/>
+            <w:r>
+              <w:rPr>
+                <w:sz w:val="24"/>
+                <w:szCs w:val="24"/>
+              </w:rPr>
+              <w:t>" constraint was violated — the model bridged the query's indirect date reference using its own background knowledge, not retrieval</w:t>
+            </w:r>
+            <w:r>
+              <w:rPr>
+                <w:sz w:val="24"/>
+                <w:szCs w:val="24"/>
+              </w:rPr>
+              <w:t xml:space="preserve">. </w:t>
+            </w:r>
+          </w:p>
+        </w:tc>
+      </w:tr>
+    </w:tbl>
+    <w:p/>
+    <w:p/>
+    <w:tbl>
+      <w:tblPr>
+        <w:tblW w:w="10080" w:type="dxa"/>
+        <w:jc w:val="center"/>
+        <w:tblLayout w:type="fixed"/>
+        <w:tblLook w:val="0400" w:firstRow="0" w:lastRow="0" w:firstColumn="0" w:lastColumn="0" w:noHBand="0" w:noVBand="1"/>
+      </w:tblPr>
+      <w:tblGrid>
+        <w:gridCol w:w="10080"/>
+      </w:tblGrid>
+      <w:tr>
+        <w:trPr>
+          <w:jc w:val="center"/>
+        </w:trPr>
+        <w:tc>
+          <w:tcPr>
+            <w:tcW w:w="10080" w:type="dxa"/>
+            <w:tcBorders>
+              <w:top w:val="single" w:sz="6" w:space="0" w:color="BFBFBF"/>
+              <w:left w:val="single" w:sz="6" w:space="0" w:color="BFBFBF"/>
+              <w:bottom w:val="single" w:sz="6" w:space="0" w:color="BFBFBF"/>
+              <w:right w:val="single" w:sz="6" w:space="0" w:color="BFBFBF"/>
+            </w:tcBorders>
+            <w:shd w:val="clear" w:color="auto" w:fill="F2F2F2"/>
+          </w:tcPr>
+          <w:p>
+            <w:pPr>
+              <w:rPr>
+                <w:sz w:val="24"/>
+                <w:szCs w:val="24"/>
+              </w:rPr>
+            </w:pPr>
+            <w:r>
+              <w:rPr>
+                <w:b/>
+                <w:bCs/>
+                <w:sz w:val="24"/>
+                <w:szCs w:val="24"/>
+              </w:rPr>
+              <w:t xml:space="preserve">Query </w:t>
+            </w:r>
+            <w:r>
+              <w:rPr>
+                <w:b/>
+                <w:bCs/>
+                <w:sz w:val="24"/>
+                <w:szCs w:val="24"/>
+              </w:rPr>
+              <w:t>5</w:t>
+            </w:r>
+          </w:p>
+        </w:tc>
+      </w:tr>
+      <w:tr>
+        <w:trPr>
+          <w:jc w:val="center"/>
+        </w:trPr>
+        <w:tc>
+          <w:tcPr>
+            <w:tcW w:w="10080" w:type="dxa"/>
+            <w:tcBorders>
+              <w:top w:val="single" w:sz="6" w:space="0" w:color="BFBFBF"/>
+              <w:left w:val="single" w:sz="6" w:space="0" w:color="BFBFBF"/>
+              <w:bottom w:val="single" w:sz="6" w:space="0" w:color="BFBFBF"/>
+              <w:right w:val="single" w:sz="6" w:space="0" w:color="BFBFBF"/>
+            </w:tcBorders>
+          </w:tcPr>
+          <w:p>
+            <w:pPr>
+              <w:rPr>
+                <w:sz w:val="24"/>
+                <w:szCs w:val="24"/>
+              </w:rPr>
+            </w:pPr>
+            <w:r>
+              <w:rPr>
+                <w:sz w:val="24"/>
+                <w:szCs w:val="24"/>
+              </w:rPr>
+              <w:t>Query:</w:t>
+            </w:r>
+            <w:r>
+              <w:rPr>
+                <w:sz w:val="24"/>
+                <w:szCs w:val="24"/>
+              </w:rPr>
+              <w:t xml:space="preserve"> </w:t>
+            </w:r>
+            <w:r>
+              <w:rPr>
+                <w:sz w:val="24"/>
+                <w:szCs w:val="24"/>
+              </w:rPr>
+              <w:t>In the IOC vote that awarded the 1992 Winter Games, which two cities tied and were sent to a run-off, what were their run-off vote totals, and which city was eliminated after the very first round?</w:t>
+            </w:r>
+          </w:p>
+          <w:p>
+            <w:pPr>
+              <w:rPr>
+                <w:sz w:val="24"/>
+                <w:szCs w:val="24"/>
+              </w:rPr>
+            </w:pPr>
+            <w:r>
+              <w:rPr>
+                <w:sz w:val="24"/>
+                <w:szCs w:val="24"/>
+              </w:rPr>
+              <w:t>Retrieved results:</w:t>
+            </w:r>
+            <w:r>
+              <w:rPr>
+                <w:sz w:val="24"/>
+                <w:szCs w:val="24"/>
+              </w:rPr>
+              <w:t xml:space="preserve"> </w:t>
+            </w:r>
+            <w:r>
+              <w:rPr>
+                <w:sz w:val="24"/>
+                <w:szCs w:val="24"/>
+              </w:rPr>
+              <w:t>The documents do **not** say that any 1992 Winter Games IOC vote had a tie and run-off between two cities.</w:t>
+            </w:r>
+          </w:p>
+          <w:p>
+            <w:pPr>
+              <w:rPr>
+                <w:sz w:val="24"/>
+                <w:szCs w:val="24"/>
+              </w:rPr>
+            </w:pPr>
+            <w:r>
+              <w:rPr>
+                <w:sz w:val="24"/>
+                <w:szCs w:val="24"/>
+              </w:rPr>
+              <w:t>What the documents do say about a run-off is for the **1988 Winter Olympics**: the bid was between **Calgary, Falun, and Cortina d'Ampezzo**, and:</w:t>
+            </w:r>
+          </w:p>
+          <w:p>
+            <w:pPr>
+              <w:rPr>
+                <w:sz w:val="24"/>
+                <w:szCs w:val="24"/>
+              </w:rPr>
+            </w:pPr>
+            <w:r>
+              <w:rPr>
+                <w:sz w:val="24"/>
+                <w:szCs w:val="24"/>
+              </w:rPr>
+              <w:t xml:space="preserve">- “**After Cortina d'Ampezzo was eliminated in the first round of balloting, Calgary won in the second and final round of balloting over Falun, by a margin of 17 </w:t>
+            </w:r>
+            <w:proofErr w:type="gramStart"/>
+            <w:r>
+              <w:rPr>
+                <w:sz w:val="24"/>
+                <w:szCs w:val="24"/>
+              </w:rPr>
+              <w:t>votes.*</w:t>
+            </w:r>
+            <w:proofErr w:type="gramEnd"/>
+            <w:r>
+              <w:rPr>
+                <w:sz w:val="24"/>
+                <w:szCs w:val="24"/>
+              </w:rPr>
+              <w:t>*”</w:t>
+            </w:r>
+          </w:p>
+          <w:p>
+            <w:pPr>
+              <w:rPr>
+                <w:sz w:val="24"/>
+                <w:szCs w:val="24"/>
+              </w:rPr>
+            </w:pPr>
+            <w:r>
+              <w:rPr>
+                <w:sz w:val="24"/>
+                <w:szCs w:val="24"/>
+              </w:rPr>
+              <w:t xml:space="preserve">So, from the </w:t>
+            </w:r>
+            <w:proofErr w:type="gramStart"/>
+            <w:r>
+              <w:rPr>
+                <w:sz w:val="24"/>
+                <w:szCs w:val="24"/>
+              </w:rPr>
+              <w:t>provided documents</w:t>
+            </w:r>
+            <w:proofErr w:type="gramEnd"/>
+            <w:r>
+              <w:rPr>
+                <w:sz w:val="24"/>
+                <w:szCs w:val="24"/>
+              </w:rPr>
+              <w:t>:</w:t>
+            </w:r>
+          </w:p>
+          <w:p>
+            <w:pPr>
+              <w:rPr>
+                <w:sz w:val="24"/>
+                <w:szCs w:val="24"/>
+              </w:rPr>
+            </w:pPr>
+            <w:r>
+              <w:rPr>
+                <w:sz w:val="24"/>
+                <w:szCs w:val="24"/>
+              </w:rPr>
+              <w:t xml:space="preserve">- **Eliminated after the first </w:t>
+            </w:r>
+            <w:proofErr w:type="gramStart"/>
+            <w:r>
+              <w:rPr>
+                <w:sz w:val="24"/>
+                <w:szCs w:val="24"/>
+              </w:rPr>
+              <w:t>round:*</w:t>
+            </w:r>
+            <w:proofErr w:type="gramEnd"/>
+            <w:r>
+              <w:rPr>
+                <w:sz w:val="24"/>
+                <w:szCs w:val="24"/>
+              </w:rPr>
+              <w:t>* **Cortina d'Ampezzo**</w:t>
+            </w:r>
+            <w:r>
+              <w:rPr>
+                <w:sz w:val="24"/>
+                <w:szCs w:val="24"/>
+              </w:rPr>
+              <w:br/>
+            </w:r>
+            <w:r>
+              <w:rPr>
+                <w:sz w:val="24"/>
+                <w:szCs w:val="24"/>
+              </w:rPr>
+              <w:t xml:space="preserve">- **Run-off </w:t>
+            </w:r>
+            <w:proofErr w:type="gramStart"/>
+            <w:r>
+              <w:rPr>
+                <w:sz w:val="24"/>
+                <w:szCs w:val="24"/>
+              </w:rPr>
+              <w:t>cities:*</w:t>
+            </w:r>
+            <w:proofErr w:type="gramEnd"/>
+            <w:r>
+              <w:rPr>
+                <w:sz w:val="24"/>
+                <w:szCs w:val="24"/>
+              </w:rPr>
+              <w:t>* **Calgary** and **Falun**</w:t>
+            </w:r>
+            <w:r>
+              <w:rPr>
+                <w:sz w:val="24"/>
+                <w:szCs w:val="24"/>
+              </w:rPr>
+              <w:br/>
+            </w:r>
+            <w:r>
+              <w:rPr>
+                <w:sz w:val="24"/>
+                <w:szCs w:val="24"/>
+              </w:rPr>
+              <w:t xml:space="preserve">- **Run-off vote </w:t>
+            </w:r>
+            <w:proofErr w:type="gramStart"/>
+            <w:r>
+              <w:rPr>
+                <w:sz w:val="24"/>
+                <w:szCs w:val="24"/>
+              </w:rPr>
+              <w:t>totals:*</w:t>
+            </w:r>
+            <w:proofErr w:type="gramEnd"/>
+            <w:r>
+              <w:rPr>
+                <w:sz w:val="24"/>
+                <w:szCs w:val="24"/>
+              </w:rPr>
+              <w:t>* the document gives only that Calgary won “**by a margin of 17 votes**,” not the full totals for each city.</w:t>
+            </w:r>
+          </w:p>
+          <w:p>
+            <w:pPr>
+              <w:rPr>
+                <w:sz w:val="24"/>
+                <w:szCs w:val="24"/>
+              </w:rPr>
+            </w:pPr>
+            <w:r>
+              <w:rPr>
+                <w:sz w:val="24"/>
+                <w:szCs w:val="24"/>
+              </w:rPr>
+              <w:lastRenderedPageBreak/>
+              <w:t>Observations:</w:t>
+            </w:r>
           </w:p>
           <w:p>
             <w:pPr>
@@ -1536,6 +4406,213 @@
                 <w:szCs w:val="24"/>
               </w:rPr>
             </w:pPr>
+            <w:r>
+              <w:rPr>
+                <w:sz w:val="24"/>
+                <w:szCs w:val="24"/>
+              </w:rPr>
+              <w:t xml:space="preserve">What worked well? What limitations, challenges, or unexpected retrieval behaviors did you observe? </w:t>
+            </w:r>
+          </w:p>
+          <w:p>
+            <w:pPr>
+              <w:spacing w:after="120"/>
+              <w:rPr>
+                <w:sz w:val="24"/>
+                <w:szCs w:val="24"/>
+              </w:rPr>
+            </w:pPr>
+            <w:r>
+              <w:rPr>
+                <w:sz w:val="24"/>
+                <w:szCs w:val="24"/>
+              </w:rPr>
+              <w:t xml:space="preserve">Here again the retriever failed to find the most relevant documents and ended up answering the wrong question. The expected answer would have stated that </w:t>
+            </w:r>
+            <w:r>
+              <w:rPr>
+                <w:sz w:val="24"/>
+                <w:szCs w:val="24"/>
+              </w:rPr>
+              <w:t>Falun (Sweden) and Lillehammer (Norway) tied 11–11 in round 4,</w:t>
+            </w:r>
+            <w:r>
+              <w:rPr>
+                <w:sz w:val="24"/>
+                <w:szCs w:val="24"/>
+              </w:rPr>
+              <w:t xml:space="preserve"> the scores in the r</w:t>
+            </w:r>
+            <w:r>
+              <w:rPr>
+                <w:sz w:val="24"/>
+                <w:szCs w:val="24"/>
+              </w:rPr>
+              <w:t>un-off</w:t>
+            </w:r>
+            <w:r>
+              <w:rPr>
+                <w:sz w:val="24"/>
+                <w:szCs w:val="24"/>
+              </w:rPr>
+              <w:t xml:space="preserve"> were</w:t>
+            </w:r>
+            <w:r>
+              <w:rPr>
+                <w:sz w:val="24"/>
+                <w:szCs w:val="24"/>
+              </w:rPr>
+              <w:t xml:space="preserve"> Falun 41, Lillehammer 40,</w:t>
+            </w:r>
+            <w:r>
+              <w:rPr>
+                <w:sz w:val="24"/>
+                <w:szCs w:val="24"/>
+              </w:rPr>
+              <w:t xml:space="preserve"> and the team e</w:t>
+            </w:r>
+            <w:r>
+              <w:rPr>
+                <w:sz w:val="24"/>
+                <w:szCs w:val="24"/>
+              </w:rPr>
+              <w:t>liminated after round 1</w:t>
+            </w:r>
+            <w:r>
+              <w:rPr>
+                <w:sz w:val="24"/>
+                <w:szCs w:val="24"/>
+              </w:rPr>
+              <w:t xml:space="preserve"> was</w:t>
+            </w:r>
+            <w:r>
+              <w:rPr>
+                <w:sz w:val="24"/>
+                <w:szCs w:val="24"/>
+              </w:rPr>
+              <w:t xml:space="preserve"> Berchtesgaden (West Germany)</w:t>
+            </w:r>
+            <w:r>
+              <w:rPr>
+                <w:sz w:val="24"/>
+                <w:szCs w:val="24"/>
+              </w:rPr>
+              <w:t xml:space="preserve">, all available from the </w:t>
+            </w:r>
+            <w:r>
+              <w:rPr>
+                <w:sz w:val="24"/>
+                <w:szCs w:val="24"/>
+              </w:rPr>
+              <w:t>1992_Winter_Olympics.html bidding-results table</w:t>
+            </w:r>
+            <w:r>
+              <w:rPr>
+                <w:sz w:val="24"/>
+                <w:szCs w:val="24"/>
+              </w:rPr>
+              <w:t xml:space="preserve">. Instead of retrieving the </w:t>
+            </w:r>
+            <w:r>
+              <w:rPr>
+                <w:sz w:val="24"/>
+                <w:szCs w:val="24"/>
+              </w:rPr>
+              <w:t>1992 article</w:t>
+            </w:r>
+            <w:r>
+              <w:rPr>
+                <w:sz w:val="24"/>
+                <w:szCs w:val="24"/>
+              </w:rPr>
+              <w:t xml:space="preserve">, </w:t>
+            </w:r>
+            <w:r>
+              <w:rPr>
+                <w:sz w:val="24"/>
+                <w:szCs w:val="24"/>
+              </w:rPr>
+              <w:t>the</w:t>
+            </w:r>
+            <w:r>
+              <w:rPr>
+                <w:sz w:val="24"/>
+                <w:szCs w:val="24"/>
+              </w:rPr>
+              <w:t xml:space="preserve"> retriever chose </w:t>
+            </w:r>
+            <w:proofErr w:type="spellStart"/>
+            <w:r>
+              <w:rPr>
+                <w:sz w:val="24"/>
+                <w:szCs w:val="24"/>
+              </w:rPr>
+              <w:t>Australia_at_the_Olympics</w:t>
+            </w:r>
+            <w:proofErr w:type="spellEnd"/>
+            <w:r>
+              <w:rPr>
+                <w:sz w:val="24"/>
+                <w:szCs w:val="24"/>
+              </w:rPr>
+              <w:t xml:space="preserve">, 1988_Winter_Olympics, </w:t>
+            </w:r>
+            <w:r>
+              <w:rPr>
+                <w:sz w:val="24"/>
+                <w:szCs w:val="24"/>
+              </w:rPr>
+              <w:t xml:space="preserve">and </w:t>
+            </w:r>
+            <w:r>
+              <w:rPr>
+                <w:sz w:val="24"/>
+                <w:szCs w:val="24"/>
+              </w:rPr>
+              <w:t>1988_Summer_Olympics</w:t>
+            </w:r>
+            <w:r>
+              <w:rPr>
+                <w:sz w:val="24"/>
+                <w:szCs w:val="24"/>
+              </w:rPr>
+              <w:t>, because</w:t>
+            </w:r>
+            <w:r>
+              <w:rPr>
+                <w:sz w:val="24"/>
+                <w:szCs w:val="24"/>
+              </w:rPr>
+              <w:t xml:space="preserve"> 1992_Winter_Olympics</w:t>
+            </w:r>
+            <w:r>
+              <w:rPr>
+                <w:sz w:val="24"/>
+                <w:szCs w:val="24"/>
+              </w:rPr>
+              <w:t>.html</w:t>
+            </w:r>
+            <w:r>
+              <w:rPr>
+                <w:sz w:val="24"/>
+                <w:szCs w:val="24"/>
+              </w:rPr>
+              <w:t xml:space="preserve"> contains </w:t>
+            </w:r>
+            <w:r>
+              <w:rPr>
+                <w:sz w:val="24"/>
+                <w:szCs w:val="24"/>
+              </w:rPr>
+              <w:t>no</w:t>
+            </w:r>
+            <w:r>
+              <w:rPr>
+                <w:sz w:val="24"/>
+                <w:szCs w:val="24"/>
+              </w:rPr>
+              <w:t xml:space="preserve"> occurrences of "tied", "eliminated", "cities", or "awarded". The 1988 Winter article, by contrast, has prose saying Cortina was "eliminated in the first round of balloting" and Calgary won a final round over Falun, so it matches both lexically and semantically.</w:t>
+            </w:r>
           </w:p>
         </w:tc>
       </w:tr>
@@ -1696,15 +4773,27 @@
                 <w:szCs w:val="24"/>
               </w:rPr>
             </w:pPr>
-          </w:p>
-          <w:p>
-            <w:pPr>
-              <w:spacing w:after="120"/>
-              <w:rPr>
-                <w:sz w:val="24"/>
-                <w:szCs w:val="24"/>
-              </w:rPr>
-            </w:pPr>
+            <w:r>
+              <w:rPr>
+                <w:sz w:val="24"/>
+                <w:szCs w:val="24"/>
+              </w:rPr>
+              <w:t>The strategy worked w</w:t>
+            </w:r>
+            <w:r>
+              <w:rPr>
+                <w:sz w:val="24"/>
+                <w:szCs w:val="24"/>
+              </w:rPr>
+              <w:t>e</w:t>
+            </w:r>
+            <w:r>
+              <w:rPr>
+                <w:sz w:val="24"/>
+                <w:szCs w:val="24"/>
+              </w:rPr>
+              <w:t xml:space="preserve">ll for simple queries that were easily matched via keyword or semantics to one specific HTML file and where the HTML file contained all the information in the underlying Wikipedia article. Even when the question used different wording than the article, the retriever was able to find the most relevant article via semantic search. </w:t>
+            </w:r>
           </w:p>
           <w:p>
             <w:pPr>
@@ -1807,15 +4896,86 @@
                 <w:szCs w:val="24"/>
               </w:rPr>
             </w:pPr>
-          </w:p>
-          <w:p>
-            <w:pPr>
-              <w:spacing w:after="120"/>
-              <w:rPr>
-                <w:sz w:val="24"/>
-                <w:szCs w:val="24"/>
-              </w:rPr>
-            </w:pPr>
+            <w:r>
+              <w:rPr>
+                <w:sz w:val="24"/>
+                <w:szCs w:val="24"/>
+              </w:rPr>
+              <w:t xml:space="preserve">The strategy did not work well with more complex queries that required information from multiple articles, or involved long lists of information, or where some information in the underlying Wikipedia </w:t>
+            </w:r>
+            <w:r>
+              <w:rPr>
+                <w:sz w:val="24"/>
+                <w:szCs w:val="24"/>
+              </w:rPr>
+              <w:lastRenderedPageBreak/>
+              <w:t xml:space="preserve">file was missing because the file extractor was not </w:t>
+            </w:r>
+            <w:r>
+              <w:rPr>
+                <w:sz w:val="24"/>
+                <w:szCs w:val="24"/>
+              </w:rPr>
+              <w:t xml:space="preserve">always </w:t>
+            </w:r>
+            <w:r>
+              <w:rPr>
+                <w:sz w:val="24"/>
+                <w:szCs w:val="24"/>
+              </w:rPr>
+              <w:t xml:space="preserve">able to parse it (such as tables). </w:t>
+            </w:r>
+            <w:r>
+              <w:rPr>
+                <w:sz w:val="24"/>
+                <w:szCs w:val="24"/>
+              </w:rPr>
+              <w:t xml:space="preserve">In the examples reported here </w:t>
+            </w:r>
+            <w:proofErr w:type="spellStart"/>
+            <w:r>
+              <w:rPr>
+                <w:sz w:val="24"/>
+                <w:szCs w:val="24"/>
+              </w:rPr>
+              <w:t>Trafilatura</w:t>
+            </w:r>
+            <w:proofErr w:type="spellEnd"/>
+            <w:r>
+              <w:rPr>
+                <w:sz w:val="24"/>
+                <w:szCs w:val="24"/>
+              </w:rPr>
+              <w:t xml:space="preserve"> retained the table values as flattened text, but did not preserve explicit rows, columns, or table semantics. In these tests, the primary failure was retrieving the wrong articles. </w:t>
+            </w:r>
+            <w:r>
+              <w:rPr>
+                <w:sz w:val="24"/>
+                <w:szCs w:val="24"/>
+              </w:rPr>
+              <w:t>But e</w:t>
+            </w:r>
+            <w:r>
+              <w:rPr>
+                <w:sz w:val="24"/>
+                <w:szCs w:val="24"/>
+              </w:rPr>
+              <w:t>ven if the correct articles had been retrieved, interpreting flattened tables could still have presented an additional challenge.</w:t>
+            </w:r>
+            <w:r>
+              <w:rPr>
+                <w:sz w:val="24"/>
+                <w:szCs w:val="24"/>
+              </w:rPr>
+              <w:t xml:space="preserve"> </w:t>
+            </w:r>
+            <w:r>
+              <w:rPr>
+                <w:sz w:val="24"/>
+                <w:szCs w:val="24"/>
+              </w:rPr>
+              <w:t>The strategy also failed silently by going outside of its remit and accessing information from parametric memory, which could be a real integrity problem in real-world systems.</w:t>
+            </w:r>
           </w:p>
           <w:p>
             <w:pPr>
@@ -1919,24 +5079,13 @@
                 <w:szCs w:val="24"/>
               </w:rPr>
             </w:pPr>
-          </w:p>
-          <w:p>
-            <w:pPr>
-              <w:spacing w:after="120"/>
-              <w:rPr>
-                <w:sz w:val="24"/>
-                <w:szCs w:val="24"/>
-              </w:rPr>
-            </w:pPr>
-          </w:p>
-          <w:p>
-            <w:pPr>
-              <w:spacing w:after="120"/>
-              <w:rPr>
-                <w:sz w:val="24"/>
-                <w:szCs w:val="24"/>
-              </w:rPr>
-            </w:pPr>
+            <w:r>
+              <w:rPr>
+                <w:sz w:val="24"/>
+                <w:szCs w:val="24"/>
+              </w:rPr>
+              <w:t xml:space="preserve">The main pattern was the retriever making sub-optimal choices about which documents were most relevant. On the plus side I was often surprised about what it WAS able to answer: the combination of keyword plus semantic search is, indeed, powerful. Another pattern was not having the actual information in its context because the text extractor missed out some of the underlying information. </w:t>
+            </w:r>
           </w:p>
         </w:tc>
       </w:tr>
@@ -1965,7 +5114,15 @@
         <w:spacing w:after="0"/>
       </w:pPr>
       <w:r>
-        <w:t>If you were continuing to improve this system, would you keep the same retrieval approach or make changes? Explain your reasoning.</w:t>
+        <w:t xml:space="preserve">If you </w:t>
+      </w:r>
+      <w:proofErr w:type="gramStart"/>
+      <w:r>
+        <w:t>were continuing</w:t>
+      </w:r>
+      <w:proofErr w:type="gramEnd"/>
+      <w:r>
+        <w:t xml:space="preserve"> to improve this system, would you keep the same retrieval approach or make changes? Explain your reasoning.</w:t>
       </w:r>
     </w:p>
     <w:tbl>
@@ -2040,42 +5197,108 @@
               </w:rPr>
               <w:t>Response:</w:t>
             </w:r>
-          </w:p>
-          <w:p>
-            <w:pPr>
-              <w:spacing w:after="120"/>
-              <w:rPr>
-                <w:sz w:val="24"/>
-                <w:szCs w:val="24"/>
-              </w:rPr>
-            </w:pPr>
-          </w:p>
-          <w:p>
-            <w:pPr>
-              <w:spacing w:after="120"/>
-              <w:rPr>
-                <w:sz w:val="24"/>
-                <w:szCs w:val="24"/>
-              </w:rPr>
-            </w:pPr>
-          </w:p>
-          <w:p>
-            <w:pPr>
-              <w:spacing w:after="120"/>
-              <w:rPr>
-                <w:sz w:val="24"/>
-                <w:szCs w:val="24"/>
-              </w:rPr>
-            </w:pPr>
-          </w:p>
-          <w:p>
-            <w:pPr>
-              <w:spacing w:after="120"/>
-              <w:rPr>
-                <w:sz w:val="24"/>
-                <w:szCs w:val="24"/>
-              </w:rPr>
-            </w:pPr>
+            <w:r>
+              <w:rPr>
+                <w:sz w:val="24"/>
+                <w:szCs w:val="24"/>
+              </w:rPr>
+              <w:t xml:space="preserve"> Other than increasing TOP_K to, say, 5, and CANDIDATE</w:t>
+            </w:r>
+            <w:r>
+              <w:rPr>
+                <w:sz w:val="24"/>
+                <w:szCs w:val="24"/>
+              </w:rPr>
+              <w:t xml:space="preserve">_POOL to, say, 50, I am considering adding a third retriever to match the query against the file names or Wikipedia article titles. Perhaps the weight for this third retriever could be 0.2 versus the keyword and vector retrievers at 0.4. I would need to normalize and fuse all three results. In </w:t>
+            </w:r>
+            <w:proofErr w:type="gramStart"/>
+            <w:r>
+              <w:rPr>
+                <w:sz w:val="24"/>
+                <w:szCs w:val="24"/>
+              </w:rPr>
+              <w:t>addition</w:t>
+            </w:r>
+            <w:proofErr w:type="gramEnd"/>
+            <w:r>
+              <w:rPr>
+                <w:sz w:val="24"/>
+                <w:szCs w:val="24"/>
+              </w:rPr>
+              <w:t xml:space="preserve"> I am considering enhancing the extraction routine to parse the headings, the tables, and the semantic properties of the articles, including the </w:t>
+            </w:r>
+            <w:proofErr w:type="spellStart"/>
+            <w:r>
+              <w:rPr>
+                <w:sz w:val="24"/>
+                <w:szCs w:val="24"/>
+              </w:rPr>
+              <w:t>wikilinks</w:t>
+            </w:r>
+            <w:proofErr w:type="spellEnd"/>
+            <w:r>
+              <w:rPr>
+                <w:sz w:val="24"/>
+                <w:szCs w:val="24"/>
+              </w:rPr>
+              <w:t xml:space="preserve">, </w:t>
+            </w:r>
+            <w:proofErr w:type="spellStart"/>
+            <w:r>
+              <w:rPr>
+                <w:sz w:val="24"/>
+                <w:szCs w:val="24"/>
+              </w:rPr>
+              <w:t>wikitables</w:t>
+            </w:r>
+            <w:proofErr w:type="spellEnd"/>
+            <w:r>
+              <w:rPr>
+                <w:sz w:val="24"/>
+                <w:szCs w:val="24"/>
+              </w:rPr>
+              <w:t xml:space="preserve">, and </w:t>
+            </w:r>
+            <w:proofErr w:type="spellStart"/>
+            <w:r>
+              <w:rPr>
+                <w:sz w:val="24"/>
+                <w:szCs w:val="24"/>
+              </w:rPr>
+              <w:t>infoboxes</w:t>
+            </w:r>
+            <w:proofErr w:type="spellEnd"/>
+            <w:r>
+              <w:rPr>
+                <w:sz w:val="24"/>
+                <w:szCs w:val="24"/>
+              </w:rPr>
+              <w:t xml:space="preserve">, so that all the information is available and the headings provide salience. For very long articles I am considering splitting them and chunking </w:t>
+            </w:r>
+            <w:proofErr w:type="gramStart"/>
+            <w:r>
+              <w:rPr>
+                <w:sz w:val="24"/>
+                <w:szCs w:val="24"/>
+              </w:rPr>
+              <w:t>them</w:t>
+            </w:r>
+            <w:proofErr w:type="gramEnd"/>
+            <w:r>
+              <w:rPr>
+                <w:sz w:val="24"/>
+                <w:szCs w:val="24"/>
+              </w:rPr>
+              <w:t xml:space="preserve"> so that lost-in-the-middle situations do not occur. Finally, an agentic architecture </w:t>
+            </w:r>
+            <w:r>
+              <w:rPr>
+                <w:sz w:val="24"/>
+                <w:szCs w:val="24"/>
+              </w:rPr>
+              <w:lastRenderedPageBreak/>
+              <w:t xml:space="preserve">with a router agent that could decompose complex queries in multiple sub-queries would also improve the performance of the retriever. </w:t>
+            </w:r>
           </w:p>
         </w:tc>
       </w:tr>
@@ -2176,10 +5399,10 @@
       </w:r>
     </w:p>
     <w:sectPr>
-      <w:headerReference w:type="even" r:id="rId8"/>
-      <w:headerReference w:type="default" r:id="rId9"/>
-      <w:footerReference w:type="default" r:id="rId10"/>
-      <w:headerReference w:type="first" r:id="rId11"/>
+      <w:headerReference w:type="even" r:id="rId12"/>
+      <w:headerReference w:type="default" r:id="rId13"/>
+      <w:footerReference w:type="default" r:id="rId14"/>
+      <w:headerReference w:type="first" r:id="rId15"/>
       <w:pgSz w:w="12240" w:h="15840"/>
       <w:pgMar w:top="1440" w:right="567" w:bottom="1440" w:left="567" w:header="57" w:footer="170" w:gutter="0"/>
       <w:pgNumType w:start="1"/>
@@ -2224,8 +5447,19 @@
         <w:sz w:val="22"/>
         <w:szCs w:val="22"/>
       </w:rPr>
-      <w:t>© MIT xPRO</w:t>
+      <w:t xml:space="preserve">© MIT </w:t>
     </w:r>
+    <w:proofErr w:type="spellStart"/>
+    <w:r>
+      <w:rPr>
+        <w:rFonts w:ascii="Calibri" w:eastAsia="Calibri" w:hAnsi="Calibri" w:cs="Calibri"/>
+        <w:color w:val="000000"/>
+        <w:sz w:val="22"/>
+        <w:szCs w:val="22"/>
+      </w:rPr>
+      <w:t>xPRO</w:t>
+    </w:r>
+    <w:proofErr w:type="spellEnd"/>
     <w:r>
       <w:rPr>
         <w:rFonts w:ascii="Calibri" w:eastAsia="Calibri" w:hAnsi="Calibri" w:cs="Calibri"/>
@@ -4222,6 +7456,18 @@
       <w:contextualSpacing/>
     </w:pPr>
   </w:style>
+  <w:style w:type="character" w:styleId="UnresolvedMention">
+    <w:name w:val="Unresolved Mention"/>
+    <w:basedOn w:val="DefaultParagraphFont"/>
+    <w:uiPriority w:val="99"/>
+    <w:semiHidden/>
+    <w:unhideWhenUsed/>
+    <w:rsid w:val="008233A7"/>
+    <w:rPr>
+      <w:color w:val="605E5C"/>
+      <w:shd w:val="clear" w:color="auto" w:fill="E1DFDD"/>
+    </w:rPr>
+  </w:style>
 </w:styles>
 </file>
 

</xml_diff>